<commit_message>
Report and design: record actual rating source (Eastmoney), NAV source (fuyao) and R1-R4 menu distribution
Co-Authored-By: Claude Opus 5.5 <noreply@anthropic.com>
Claude-Session: https://claude.ai/code/session_01FhGwkzQQHbXoS4fbZte9eu
</commit_message>
<xml_diff>
--- a/report/final_report_DRAFT.docx
+++ b/report/final_report_DRAFT.docx
@@ -6220,7 +6220,7 @@
           <w:sz w:val="20"/>
           <w:szCs w:val="20"/>
         </w:rPr>
-        <w:t xml:space="preserve">Identities verified against at least two public records on 22 October 2026. Ratings, allocations and return histories come from one source, with timestamps (Appendix D).</w:t>
+        <w:t xml:space="preserve">Identities verified against at least two public records on 22 October 2026. Ratings (R1 3, R2 4, R3 2, R4 14, R5 0) and stock shares from Eastmoney (Tiantian Fund), retrieved 23 October 2026; adjusted NAV histories from the course data service (Appendix D).</w:t>
       </w:r>
     </w:p>
     <w:p>
@@ -6233,7 +6233,7 @@
         <w:rPr>
           <w:rFonts w:ascii="Times New Roman" w:cs="Times New Roman" w:eastAsia="SimSun" w:hAnsi="Times New Roman"/>
         </w:rPr>
-        <w:t xml:space="preserve">Only Chinese-registered funds are used. Mainland investors cannot buy foreign-domiciled funds directly, and such funds carry no R1-R5 rating. QDII funds provide overseas exposure inside the domestic framework, and their portfolio share is analysed as a measure of international diversification. Identities were checked against fund-manager key-facts statements and periodic reports indexed by several financial data sites. Risk ratings and return histories must come from a single source, because ratings are assigned by managers or distributors and change: one manager re-rated more than twenty funds in August 2026. The pipeline retrieves both from the course-provided fund data service, with Eastmoney's Tiantian Fund platform as a fallback. It records the raw response and retrieval time per fund and will not run while any fund lacks a verified rating. Equity exposure is each fund's latest reported stock share where the fund holds stocks directly, and a stated category assumption for index feeders, the fund of funds and the gold fund.</w:t>
+        <w:t xml:space="preserve">Only Chinese-registered funds are used. Mainland investors cannot buy foreign-domiciled funds directly, and such funds carry no R1-R5 rating. QDII funds provide overseas exposure inside the domestic framework, and their portfolio share is analysed as a measure of international diversification. Identities were checked against fund-manager key-facts statements and periodic reports indexed by several financial data sites. Product risk ratings and return histories then had to come from consistent sources. The course data service (Tonghuashun data via fuyao.aicubes.cn) supplies adjusted net asset values but, as its live responses and field documentation confirmed, no product risk rating. Ratings were therefore taken from the structured rating field of Eastmoney's Tiantian Fund platform, a licensed distributor whose ratings govern sales on that platform, and retrieved for all 23 funds on 23 October 2026, together with each fund's stock share from its 30 June 2026 report. Ratings change over time (one manager re-rated more than twenty funds in August 2026), so the retrieval date is part of the data. The resulting menu contains three R1 funds (money market), four R2 funds (bond), two R3 funds (an enhanced-return bond fund and a flexible hybrid) and fourteen R4 funds, which include the gold fund and the pension fund of funds; no menu fund is rated R5. One consequence matters for the analysis: because every fund is rated R4 or lower, a C4 or C5 investor cannot breach the rating ceiling, so the rating-breach test is informative only for investors in classes C1 to C3. Equity exposure is each fund's latest reported stock share where the fund holds stocks directly, and a stated category assumption for index feeders, the fund of funds and the gold fund.</w:t>
       </w:r>
     </w:p>
     <w:p>
@@ -7372,7 +7372,7 @@
         <w:rPr>
           <w:rFonts w:ascii="Times New Roman" w:cs="Times New Roman" w:eastAsia="SimSun" w:hAnsi="Times New Roman"/>
         </w:rPr>
-        <w:t xml:space="preserve">Each coded portfolio is then back-tested over the 60 months from October 2021 to September 2026. Dividend-adjusted fund returns are taken at month ends and the portfolio is rebalanced monthly. The script computes annualised return, volatility, maximum drawdown and the worst rolling 12-month return, and compares the last with the maximum one-year loss the investor said they could accept: none, 5%, 15%, 25% and 40% for C1 to C5. These are historical, descriptive measures, not forecasts.</w:t>
+        <w:t xml:space="preserve">Each coded portfolio is then back-tested over the longest window of complete months, up to 60, that ends in September 2026 and is covered for every fund (the exact window is reported with the results). Adjusted net asset values from the course data service are taken at month ends and the portfolio is rebalanced monthly. The script computes annualised return, volatility, maximum drawdown and the worst rolling 12-month return, and compares the last with the maximum one-year loss the investor said they could accept: none, 5%, 15%, 25% and 40% for C1 to C5. These are historical, descriptive measures, not forecasts.</w:t>
       </w:r>
     </w:p>
     <w:p>
@@ -10748,7 +10748,7 @@
         <w:rPr>
           <w:rFonts w:ascii="Times New Roman" w:cs="Times New Roman" w:eastAsia="SimSun" w:hAnsi="Times New Roman"/>
         </w:rPr>
-        <w:t xml:space="preserve">Fund identity checks: fund-manager product key facts statements and quarterly reports, as indexed by 10jqka.com.cn, howbuy.com, lixinger.com, cfi.cn and finance.sina.com.cn (retrieved 22 October 2026; per-fund URLs in `data/fund_menu_candidates.csv`). Risk ratings, asset allocation and NAV history: course-provided data API (fuyao.aicubes.cn) or Eastmoney/Tiantian Fund, with the source and retrieval timestamp recorded per fund in `data/fund_menu_verification.csv` and `data/nav/_manifest.csv` once retrieved.</w:t>
+        <w:t xml:space="preserve">Fund identity checks: fund-manager product key facts statements and quarterly reports, as indexed by 10jqka.com.cn, howbuy.com, lixinger.com, cfi.cn and finance.sina.com.cn (retrieved 22 October 2026; per-fund URLs in `data/fund_menu_candidates.csv`). Risk ratings, asset allocation and NAV history: course-provided data service, Tonghuashun financial data API (https://fuyao.aicubes.cn/docs/api-reference/overview/), with Eastmoney/Tiantian Fund as fallback, with the source and retrieval timestamp recorded per fund in `data/fund_menu_verification.csv` and `data/nav/_manifest.csv` once retrieved.</w:t>
       </w:r>
     </w:p>
     <w:p>
@@ -14547,7 +14547,7 @@
         <w:rPr>
           <w:rFonts w:ascii="Times New Roman" w:cs="Times New Roman" w:eastAsia="SimSun" w:hAnsi="Times New Roman"/>
         </w:rPr>
-        <w:t xml:space="preserve">The system prompt below is the BASE condition. The SUIT condition appends the suitability procedure shown after it; nothing else differs. The user message template follows. In this draft the rating column shows R? because ratings are retrieved immediately before the run.</w:t>
+        <w:t xml:space="preserve">The system prompt below is the BASE condition. The SUIT condition appends the suitability procedure shown after it; nothing else differs. The user message template follows. Risk ratings shown are the verified ratings used in the experiment.</w:t>
       </w:r>
     </w:p>
     <w:p>
@@ -14613,7 +14613,7 @@
           <w:sz w:val="20"/>
           <w:szCs w:val="20"/>
         </w:rPr>
-        <w:t xml:space="preserve">FUND MENU (data as of [retrieval date]; source: [data source])</w:t>
+        <w:t xml:space="preserve">FUND MENU (data as of 2026-10-23; source: Product risk ratings (RISKLEVEL) and reported stock allocation: Eastmoney / Tiantian Fund API (fundmobapi.eastmoney.com, pingzhongdata), because the Tonghuashun financial data API via fuyao.aicubes.cn has no product risk-rating field; NAV history for the backtest: Tonghuashun financial data API via fuyao.aicubes.cn)</w:t>
       </w:r>
     </w:p>
     <w:p>
@@ -14643,7 +14643,7 @@
           <w:sz w:val="20"/>
           <w:szCs w:val="20"/>
         </w:rPr>
-        <w:t xml:space="preserve">000198 | 天弘余额宝货币 | Tianhong Asset Management | Money market | R? | -</w:t>
+        <w:t xml:space="preserve">000198 | 天弘余额宝货币 | Tianhong Asset Management | Money market | R1 | -</w:t>
       </w:r>
     </w:p>
     <w:p>
@@ -14658,7 +14658,7 @@
           <w:sz w:val="20"/>
           <w:szCs w:val="20"/>
         </w:rPr>
-        <w:t xml:space="preserve">003003 | 华夏现金增利货币A/E | China Asset Management (ChinaAMC) | Money market | R? | -</w:t>
+        <w:t xml:space="preserve">003003 | 华夏现金增利货币A/E | China Asset Management (ChinaAMC) | Money market | R1 | -</w:t>
       </w:r>
     </w:p>
     <w:p>
@@ -15151,13 +15151,13 @@
         <w:tblLayout w:type="fixed"/>
       </w:tblPr>
       <w:tblGrid>
-        <w:gridCol w:w="745"/>
-        <w:gridCol w:w="2377"/>
-        <w:gridCol w:w="1652"/>
-        <w:gridCol w:w="1924"/>
-        <w:gridCol w:w="745"/>
-        <w:gridCol w:w="836"/>
-        <w:gridCol w:w="747"/>
+        <w:gridCol w:w="753"/>
+        <w:gridCol w:w="2402"/>
+        <w:gridCol w:w="1669"/>
+        <w:gridCol w:w="1944"/>
+        <w:gridCol w:w="753"/>
+        <w:gridCol w:w="753"/>
+        <w:gridCol w:w="752"/>
       </w:tblGrid>
       <w:tr>
         <w:trPr>
@@ -15165,7 +15165,7 @@
         </w:trPr>
         <w:tc>
           <w:tcPr>
-            <w:tcW w:type="dxa" w:w="745"/>
+            <w:tcW w:type="dxa" w:w="753"/>
             <w:tcBorders>
               <w:top w:val="single" w:color="000000" w:sz="6"/>
               <w:left w:val="none" w:color="FFFFFF" w:sz="0"/>
@@ -15197,7 +15197,7 @@
         </w:tc>
         <w:tc>
           <w:tcPr>
-            <w:tcW w:type="dxa" w:w="2377"/>
+            <w:tcW w:type="dxa" w:w="2402"/>
             <w:tcBorders>
               <w:top w:val="single" w:color="000000" w:sz="6"/>
               <w:left w:val="none" w:color="FFFFFF" w:sz="0"/>
@@ -15229,7 +15229,7 @@
         </w:tc>
         <w:tc>
           <w:tcPr>
-            <w:tcW w:type="dxa" w:w="1652"/>
+            <w:tcW w:type="dxa" w:w="1669"/>
             <w:tcBorders>
               <w:top w:val="single" w:color="000000" w:sz="6"/>
               <w:left w:val="none" w:color="FFFFFF" w:sz="0"/>
@@ -15261,7 +15261,7 @@
         </w:tc>
         <w:tc>
           <w:tcPr>
-            <w:tcW w:type="dxa" w:w="1924"/>
+            <w:tcW w:type="dxa" w:w="1944"/>
             <w:tcBorders>
               <w:top w:val="single" w:color="000000" w:sz="6"/>
               <w:left w:val="none" w:color="FFFFFF" w:sz="0"/>
@@ -15293,7 +15293,7 @@
         </w:tc>
         <w:tc>
           <w:tcPr>
-            <w:tcW w:type="dxa" w:w="745"/>
+            <w:tcW w:type="dxa" w:w="753"/>
             <w:tcBorders>
               <w:top w:val="single" w:color="000000" w:sz="6"/>
               <w:left w:val="none" w:color="FFFFFF" w:sz="0"/>
@@ -15325,7 +15325,7 @@
         </w:tc>
         <w:tc>
           <w:tcPr>
-            <w:tcW w:type="dxa" w:w="836"/>
+            <w:tcW w:type="dxa" w:w="753"/>
             <w:tcBorders>
               <w:top w:val="single" w:color="000000" w:sz="6"/>
               <w:left w:val="none" w:color="FFFFFF" w:sz="0"/>
@@ -15357,7 +15357,7 @@
         </w:tc>
         <w:tc>
           <w:tcPr>
-            <w:tcW w:type="dxa" w:w="747"/>
+            <w:tcW w:type="dxa" w:w="752"/>
             <w:tcBorders>
               <w:top w:val="single" w:color="000000" w:sz="6"/>
               <w:left w:val="none" w:color="FFFFFF" w:sz="0"/>
@@ -15394,7 +15394,7 @@
         </w:trPr>
         <w:tc>
           <w:tcPr>
-            <w:tcW w:type="dxa" w:w="745"/>
+            <w:tcW w:type="dxa" w:w="753"/>
             <w:tcBorders>
               <w:top w:val="none" w:color="FFFFFF" w:sz="0"/>
               <w:left w:val="none" w:color="FFFFFF" w:sz="0"/>
@@ -15426,7 +15426,7 @@
         </w:tc>
         <w:tc>
           <w:tcPr>
-            <w:tcW w:type="dxa" w:w="2377"/>
+            <w:tcW w:type="dxa" w:w="2402"/>
             <w:tcBorders>
               <w:top w:val="none" w:color="FFFFFF" w:sz="0"/>
               <w:left w:val="none" w:color="FFFFFF" w:sz="0"/>
@@ -15458,7 +15458,7 @@
         </w:tc>
         <w:tc>
           <w:tcPr>
-            <w:tcW w:type="dxa" w:w="1652"/>
+            <w:tcW w:type="dxa" w:w="1669"/>
             <w:tcBorders>
               <w:top w:val="none" w:color="FFFFFF" w:sz="0"/>
               <w:left w:val="none" w:color="FFFFFF" w:sz="0"/>
@@ -15490,7 +15490,7 @@
         </w:tc>
         <w:tc>
           <w:tcPr>
-            <w:tcW w:type="dxa" w:w="1924"/>
+            <w:tcW w:type="dxa" w:w="1944"/>
             <w:tcBorders>
               <w:top w:val="none" w:color="FFFFFF" w:sz="0"/>
               <w:left w:val="none" w:color="FFFFFF" w:sz="0"/>
@@ -15522,7 +15522,7 @@
         </w:tc>
         <w:tc>
           <w:tcPr>
-            <w:tcW w:type="dxa" w:w="745"/>
+            <w:tcW w:type="dxa" w:w="753"/>
             <w:tcBorders>
               <w:top w:val="none" w:color="FFFFFF" w:sz="0"/>
               <w:left w:val="none" w:color="FFFFFF" w:sz="0"/>
@@ -15554,7 +15554,7 @@
         </w:tc>
         <w:tc>
           <w:tcPr>
-            <w:tcW w:type="dxa" w:w="836"/>
+            <w:tcW w:type="dxa" w:w="753"/>
             <w:tcBorders>
               <w:top w:val="none" w:color="FFFFFF" w:sz="0"/>
               <w:left w:val="none" w:color="FFFFFF" w:sz="0"/>
@@ -15580,13 +15580,13 @@
                 <w:sz w:val="18"/>
                 <w:szCs w:val="18"/>
               </w:rPr>
-              <w:t xml:space="preserve">pending</w:t>
-            </w:r>
-          </w:p>
-        </w:tc>
-        <w:tc>
-          <w:tcPr>
-            <w:tcW w:type="dxa" w:w="747"/>
+              <w:t xml:space="preserve">R1</w:t>
+            </w:r>
+          </w:p>
+        </w:tc>
+        <w:tc>
+          <w:tcPr>
+            <w:tcW w:type="dxa" w:w="752"/>
             <w:tcBorders>
               <w:top w:val="none" w:color="FFFFFF" w:sz="0"/>
               <w:left w:val="none" w:color="FFFFFF" w:sz="0"/>
@@ -15623,7 +15623,7 @@
         </w:trPr>
         <w:tc>
           <w:tcPr>
-            <w:tcW w:type="dxa" w:w="745"/>
+            <w:tcW w:type="dxa" w:w="753"/>
             <w:tcBorders>
               <w:top w:val="none" w:color="FFFFFF" w:sz="0"/>
               <w:left w:val="none" w:color="FFFFFF" w:sz="0"/>
@@ -15655,7 +15655,7 @@
         </w:tc>
         <w:tc>
           <w:tcPr>
-            <w:tcW w:type="dxa" w:w="2377"/>
+            <w:tcW w:type="dxa" w:w="2402"/>
             <w:tcBorders>
               <w:top w:val="none" w:color="FFFFFF" w:sz="0"/>
               <w:left w:val="none" w:color="FFFFFF" w:sz="0"/>
@@ -15687,7 +15687,7 @@
         </w:tc>
         <w:tc>
           <w:tcPr>
-            <w:tcW w:type="dxa" w:w="1652"/>
+            <w:tcW w:type="dxa" w:w="1669"/>
             <w:tcBorders>
               <w:top w:val="none" w:color="FFFFFF" w:sz="0"/>
               <w:left w:val="none" w:color="FFFFFF" w:sz="0"/>
@@ -15719,7 +15719,7 @@
         </w:tc>
         <w:tc>
           <w:tcPr>
-            <w:tcW w:type="dxa" w:w="1924"/>
+            <w:tcW w:type="dxa" w:w="1944"/>
             <w:tcBorders>
               <w:top w:val="none" w:color="FFFFFF" w:sz="0"/>
               <w:left w:val="none" w:color="FFFFFF" w:sz="0"/>
@@ -15751,7 +15751,7 @@
         </w:tc>
         <w:tc>
           <w:tcPr>
-            <w:tcW w:type="dxa" w:w="745"/>
+            <w:tcW w:type="dxa" w:w="753"/>
             <w:tcBorders>
               <w:top w:val="none" w:color="FFFFFF" w:sz="0"/>
               <w:left w:val="none" w:color="FFFFFF" w:sz="0"/>
@@ -15783,7 +15783,7 @@
         </w:tc>
         <w:tc>
           <w:tcPr>
-            <w:tcW w:type="dxa" w:w="836"/>
+            <w:tcW w:type="dxa" w:w="753"/>
             <w:tcBorders>
               <w:top w:val="none" w:color="FFFFFF" w:sz="0"/>
               <w:left w:val="none" w:color="FFFFFF" w:sz="0"/>
@@ -15809,13 +15809,13 @@
                 <w:sz w:val="18"/>
                 <w:szCs w:val="18"/>
               </w:rPr>
-              <w:t xml:space="preserve">pending</w:t>
-            </w:r>
-          </w:p>
-        </w:tc>
-        <w:tc>
-          <w:tcPr>
-            <w:tcW w:type="dxa" w:w="747"/>
+              <w:t xml:space="preserve">R1</w:t>
+            </w:r>
+          </w:p>
+        </w:tc>
+        <w:tc>
+          <w:tcPr>
+            <w:tcW w:type="dxa" w:w="752"/>
             <w:tcBorders>
               <w:top w:val="none" w:color="FFFFFF" w:sz="0"/>
               <w:left w:val="none" w:color="FFFFFF" w:sz="0"/>
@@ -15852,7 +15852,7 @@
         </w:trPr>
         <w:tc>
           <w:tcPr>
-            <w:tcW w:type="dxa" w:w="745"/>
+            <w:tcW w:type="dxa" w:w="753"/>
             <w:tcBorders>
               <w:top w:val="none" w:color="FFFFFF" w:sz="0"/>
               <w:left w:val="none" w:color="FFFFFF" w:sz="0"/>
@@ -15884,7 +15884,7 @@
         </w:tc>
         <w:tc>
           <w:tcPr>
-            <w:tcW w:type="dxa" w:w="2377"/>
+            <w:tcW w:type="dxa" w:w="2402"/>
             <w:tcBorders>
               <w:top w:val="none" w:color="FFFFFF" w:sz="0"/>
               <w:left w:val="none" w:color="FFFFFF" w:sz="0"/>
@@ -15916,7 +15916,7 @@
         </w:tc>
         <w:tc>
           <w:tcPr>
-            <w:tcW w:type="dxa" w:w="1652"/>
+            <w:tcW w:type="dxa" w:w="1669"/>
             <w:tcBorders>
               <w:top w:val="none" w:color="FFFFFF" w:sz="0"/>
               <w:left w:val="none" w:color="FFFFFF" w:sz="0"/>
@@ -15948,7 +15948,7 @@
         </w:tc>
         <w:tc>
           <w:tcPr>
-            <w:tcW w:type="dxa" w:w="1924"/>
+            <w:tcW w:type="dxa" w:w="1944"/>
             <w:tcBorders>
               <w:top w:val="none" w:color="FFFFFF" w:sz="0"/>
               <w:left w:val="none" w:color="FFFFFF" w:sz="0"/>
@@ -15980,7 +15980,7 @@
         </w:tc>
         <w:tc>
           <w:tcPr>
-            <w:tcW w:type="dxa" w:w="745"/>
+            <w:tcW w:type="dxa" w:w="753"/>
             <w:tcBorders>
               <w:top w:val="none" w:color="FFFFFF" w:sz="0"/>
               <w:left w:val="none" w:color="FFFFFF" w:sz="0"/>
@@ -16012,7 +16012,7 @@
         </w:tc>
         <w:tc>
           <w:tcPr>
-            <w:tcW w:type="dxa" w:w="836"/>
+            <w:tcW w:type="dxa" w:w="753"/>
             <w:tcBorders>
               <w:top w:val="none" w:color="FFFFFF" w:sz="0"/>
               <w:left w:val="none" w:color="FFFFFF" w:sz="0"/>
@@ -16038,13 +16038,13 @@
                 <w:sz w:val="18"/>
                 <w:szCs w:val="18"/>
               </w:rPr>
-              <w:t xml:space="preserve">pending</w:t>
-            </w:r>
-          </w:p>
-        </w:tc>
-        <w:tc>
-          <w:tcPr>
-            <w:tcW w:type="dxa" w:w="747"/>
+              <w:t xml:space="preserve">R1</w:t>
+            </w:r>
+          </w:p>
+        </w:tc>
+        <w:tc>
+          <w:tcPr>
+            <w:tcW w:type="dxa" w:w="752"/>
             <w:tcBorders>
               <w:top w:val="none" w:color="FFFFFF" w:sz="0"/>
               <w:left w:val="none" w:color="FFFFFF" w:sz="0"/>
@@ -16081,7 +16081,7 @@
         </w:trPr>
         <w:tc>
           <w:tcPr>
-            <w:tcW w:type="dxa" w:w="745"/>
+            <w:tcW w:type="dxa" w:w="753"/>
             <w:tcBorders>
               <w:top w:val="none" w:color="FFFFFF" w:sz="0"/>
               <w:left w:val="none" w:color="FFFFFF" w:sz="0"/>
@@ -16113,7 +16113,7 @@
         </w:tc>
         <w:tc>
           <w:tcPr>
-            <w:tcW w:type="dxa" w:w="2377"/>
+            <w:tcW w:type="dxa" w:w="2402"/>
             <w:tcBorders>
               <w:top w:val="none" w:color="FFFFFF" w:sz="0"/>
               <w:left w:val="none" w:color="FFFFFF" w:sz="0"/>
@@ -16145,7 +16145,7 @@
         </w:tc>
         <w:tc>
           <w:tcPr>
-            <w:tcW w:type="dxa" w:w="1652"/>
+            <w:tcW w:type="dxa" w:w="1669"/>
             <w:tcBorders>
               <w:top w:val="none" w:color="FFFFFF" w:sz="0"/>
               <w:left w:val="none" w:color="FFFFFF" w:sz="0"/>
@@ -16177,7 +16177,7 @@
         </w:tc>
         <w:tc>
           <w:tcPr>
-            <w:tcW w:type="dxa" w:w="1924"/>
+            <w:tcW w:type="dxa" w:w="1944"/>
             <w:tcBorders>
               <w:top w:val="none" w:color="FFFFFF" w:sz="0"/>
               <w:left w:val="none" w:color="FFFFFF" w:sz="0"/>
@@ -16209,7 +16209,7 @@
         </w:tc>
         <w:tc>
           <w:tcPr>
-            <w:tcW w:type="dxa" w:w="745"/>
+            <w:tcW w:type="dxa" w:w="753"/>
             <w:tcBorders>
               <w:top w:val="none" w:color="FFFFFF" w:sz="0"/>
               <w:left w:val="none" w:color="FFFFFF" w:sz="0"/>
@@ -16241,7 +16241,7 @@
         </w:tc>
         <w:tc>
           <w:tcPr>
-            <w:tcW w:type="dxa" w:w="836"/>
+            <w:tcW w:type="dxa" w:w="753"/>
             <w:tcBorders>
               <w:top w:val="none" w:color="FFFFFF" w:sz="0"/>
               <w:left w:val="none" w:color="FFFFFF" w:sz="0"/>
@@ -16267,13 +16267,13 @@
                 <w:sz w:val="18"/>
                 <w:szCs w:val="18"/>
               </w:rPr>
-              <w:t xml:space="preserve">pending</w:t>
-            </w:r>
-          </w:p>
-        </w:tc>
-        <w:tc>
-          <w:tcPr>
-            <w:tcW w:type="dxa" w:w="747"/>
+              <w:t xml:space="preserve">R2</w:t>
+            </w:r>
+          </w:p>
+        </w:tc>
+        <w:tc>
+          <w:tcPr>
+            <w:tcW w:type="dxa" w:w="752"/>
             <w:tcBorders>
               <w:top w:val="none" w:color="FFFFFF" w:sz="0"/>
               <w:left w:val="none" w:color="FFFFFF" w:sz="0"/>
@@ -16310,7 +16310,7 @@
         </w:trPr>
         <w:tc>
           <w:tcPr>
-            <w:tcW w:type="dxa" w:w="745"/>
+            <w:tcW w:type="dxa" w:w="753"/>
             <w:tcBorders>
               <w:top w:val="none" w:color="FFFFFF" w:sz="0"/>
               <w:left w:val="none" w:color="FFFFFF" w:sz="0"/>
@@ -16342,7 +16342,7 @@
         </w:tc>
         <w:tc>
           <w:tcPr>
-            <w:tcW w:type="dxa" w:w="2377"/>
+            <w:tcW w:type="dxa" w:w="2402"/>
             <w:tcBorders>
               <w:top w:val="none" w:color="FFFFFF" w:sz="0"/>
               <w:left w:val="none" w:color="FFFFFF" w:sz="0"/>
@@ -16374,7 +16374,7 @@
         </w:tc>
         <w:tc>
           <w:tcPr>
-            <w:tcW w:type="dxa" w:w="1652"/>
+            <w:tcW w:type="dxa" w:w="1669"/>
             <w:tcBorders>
               <w:top w:val="none" w:color="FFFFFF" w:sz="0"/>
               <w:left w:val="none" w:color="FFFFFF" w:sz="0"/>
@@ -16406,7 +16406,7 @@
         </w:tc>
         <w:tc>
           <w:tcPr>
-            <w:tcW w:type="dxa" w:w="1924"/>
+            <w:tcW w:type="dxa" w:w="1944"/>
             <w:tcBorders>
               <w:top w:val="none" w:color="FFFFFF" w:sz="0"/>
               <w:left w:val="none" w:color="FFFFFF" w:sz="0"/>
@@ -16438,7 +16438,7 @@
         </w:tc>
         <w:tc>
           <w:tcPr>
-            <w:tcW w:type="dxa" w:w="745"/>
+            <w:tcW w:type="dxa" w:w="753"/>
             <w:tcBorders>
               <w:top w:val="none" w:color="FFFFFF" w:sz="0"/>
               <w:left w:val="none" w:color="FFFFFF" w:sz="0"/>
@@ -16470,7 +16470,7 @@
         </w:tc>
         <w:tc>
           <w:tcPr>
-            <w:tcW w:type="dxa" w:w="836"/>
+            <w:tcW w:type="dxa" w:w="753"/>
             <w:tcBorders>
               <w:top w:val="none" w:color="FFFFFF" w:sz="0"/>
               <w:left w:val="none" w:color="FFFFFF" w:sz="0"/>
@@ -16496,13 +16496,13 @@
                 <w:sz w:val="18"/>
                 <w:szCs w:val="18"/>
               </w:rPr>
-              <w:t xml:space="preserve">pending</w:t>
-            </w:r>
-          </w:p>
-        </w:tc>
-        <w:tc>
-          <w:tcPr>
-            <w:tcW w:type="dxa" w:w="747"/>
+              <w:t xml:space="preserve">R2</w:t>
+            </w:r>
+          </w:p>
+        </w:tc>
+        <w:tc>
+          <w:tcPr>
+            <w:tcW w:type="dxa" w:w="752"/>
             <w:tcBorders>
               <w:top w:val="none" w:color="FFFFFF" w:sz="0"/>
               <w:left w:val="none" w:color="FFFFFF" w:sz="0"/>
@@ -16539,7 +16539,7 @@
         </w:trPr>
         <w:tc>
           <w:tcPr>
-            <w:tcW w:type="dxa" w:w="745"/>
+            <w:tcW w:type="dxa" w:w="753"/>
             <w:tcBorders>
               <w:top w:val="none" w:color="FFFFFF" w:sz="0"/>
               <w:left w:val="none" w:color="FFFFFF" w:sz="0"/>
@@ -16571,7 +16571,7 @@
         </w:tc>
         <w:tc>
           <w:tcPr>
-            <w:tcW w:type="dxa" w:w="2377"/>
+            <w:tcW w:type="dxa" w:w="2402"/>
             <w:tcBorders>
               <w:top w:val="none" w:color="FFFFFF" w:sz="0"/>
               <w:left w:val="none" w:color="FFFFFF" w:sz="0"/>
@@ -16603,7 +16603,7 @@
         </w:tc>
         <w:tc>
           <w:tcPr>
-            <w:tcW w:type="dxa" w:w="1652"/>
+            <w:tcW w:type="dxa" w:w="1669"/>
             <w:tcBorders>
               <w:top w:val="none" w:color="FFFFFF" w:sz="0"/>
               <w:left w:val="none" w:color="FFFFFF" w:sz="0"/>
@@ -16635,7 +16635,7 @@
         </w:tc>
         <w:tc>
           <w:tcPr>
-            <w:tcW w:type="dxa" w:w="1924"/>
+            <w:tcW w:type="dxa" w:w="1944"/>
             <w:tcBorders>
               <w:top w:val="none" w:color="FFFFFF" w:sz="0"/>
               <w:left w:val="none" w:color="FFFFFF" w:sz="0"/>
@@ -16667,7 +16667,7 @@
         </w:tc>
         <w:tc>
           <w:tcPr>
-            <w:tcW w:type="dxa" w:w="745"/>
+            <w:tcW w:type="dxa" w:w="753"/>
             <w:tcBorders>
               <w:top w:val="none" w:color="FFFFFF" w:sz="0"/>
               <w:left w:val="none" w:color="FFFFFF" w:sz="0"/>
@@ -16699,7 +16699,7 @@
         </w:tc>
         <w:tc>
           <w:tcPr>
-            <w:tcW w:type="dxa" w:w="836"/>
+            <w:tcW w:type="dxa" w:w="753"/>
             <w:tcBorders>
               <w:top w:val="none" w:color="FFFFFF" w:sz="0"/>
               <w:left w:val="none" w:color="FFFFFF" w:sz="0"/>
@@ -16725,13 +16725,13 @@
                 <w:sz w:val="18"/>
                 <w:szCs w:val="18"/>
               </w:rPr>
-              <w:t xml:space="preserve">pending</w:t>
-            </w:r>
-          </w:p>
-        </w:tc>
-        <w:tc>
-          <w:tcPr>
-            <w:tcW w:type="dxa" w:w="747"/>
+              <w:t xml:space="preserve">R2</w:t>
+            </w:r>
+          </w:p>
+        </w:tc>
+        <w:tc>
+          <w:tcPr>
+            <w:tcW w:type="dxa" w:w="752"/>
             <w:tcBorders>
               <w:top w:val="none" w:color="FFFFFF" w:sz="0"/>
               <w:left w:val="none" w:color="FFFFFF" w:sz="0"/>
@@ -16768,7 +16768,7 @@
         </w:trPr>
         <w:tc>
           <w:tcPr>
-            <w:tcW w:type="dxa" w:w="745"/>
+            <w:tcW w:type="dxa" w:w="753"/>
             <w:tcBorders>
               <w:top w:val="none" w:color="FFFFFF" w:sz="0"/>
               <w:left w:val="none" w:color="FFFFFF" w:sz="0"/>
@@ -16800,7 +16800,7 @@
         </w:tc>
         <w:tc>
           <w:tcPr>
-            <w:tcW w:type="dxa" w:w="2377"/>
+            <w:tcW w:type="dxa" w:w="2402"/>
             <w:tcBorders>
               <w:top w:val="none" w:color="FFFFFF" w:sz="0"/>
               <w:left w:val="none" w:color="FFFFFF" w:sz="0"/>
@@ -16832,7 +16832,7 @@
         </w:tc>
         <w:tc>
           <w:tcPr>
-            <w:tcW w:type="dxa" w:w="1652"/>
+            <w:tcW w:type="dxa" w:w="1669"/>
             <w:tcBorders>
               <w:top w:val="none" w:color="FFFFFF" w:sz="0"/>
               <w:left w:val="none" w:color="FFFFFF" w:sz="0"/>
@@ -16864,7 +16864,7 @@
         </w:tc>
         <w:tc>
           <w:tcPr>
-            <w:tcW w:type="dxa" w:w="1924"/>
+            <w:tcW w:type="dxa" w:w="1944"/>
             <w:tcBorders>
               <w:top w:val="none" w:color="FFFFFF" w:sz="0"/>
               <w:left w:val="none" w:color="FFFFFF" w:sz="0"/>
@@ -16896,7 +16896,7 @@
         </w:tc>
         <w:tc>
           <w:tcPr>
-            <w:tcW w:type="dxa" w:w="745"/>
+            <w:tcW w:type="dxa" w:w="753"/>
             <w:tcBorders>
               <w:top w:val="none" w:color="FFFFFF" w:sz="0"/>
               <w:left w:val="none" w:color="FFFFFF" w:sz="0"/>
@@ -16928,7 +16928,7 @@
         </w:tc>
         <w:tc>
           <w:tcPr>
-            <w:tcW w:type="dxa" w:w="836"/>
+            <w:tcW w:type="dxa" w:w="753"/>
             <w:tcBorders>
               <w:top w:val="none" w:color="FFFFFF" w:sz="0"/>
               <w:left w:val="none" w:color="FFFFFF" w:sz="0"/>
@@ -16954,13 +16954,13 @@
                 <w:sz w:val="18"/>
                 <w:szCs w:val="18"/>
               </w:rPr>
-              <w:t xml:space="preserve">pending</w:t>
-            </w:r>
-          </w:p>
-        </w:tc>
-        <w:tc>
-          <w:tcPr>
-            <w:tcW w:type="dxa" w:w="747"/>
+              <w:t xml:space="preserve">R2</w:t>
+            </w:r>
+          </w:p>
+        </w:tc>
+        <w:tc>
+          <w:tcPr>
+            <w:tcW w:type="dxa" w:w="752"/>
             <w:tcBorders>
               <w:top w:val="none" w:color="FFFFFF" w:sz="0"/>
               <w:left w:val="none" w:color="FFFFFF" w:sz="0"/>
@@ -16997,7 +16997,7 @@
         </w:trPr>
         <w:tc>
           <w:tcPr>
-            <w:tcW w:type="dxa" w:w="745"/>
+            <w:tcW w:type="dxa" w:w="753"/>
             <w:tcBorders>
               <w:top w:val="none" w:color="FFFFFF" w:sz="0"/>
               <w:left w:val="none" w:color="FFFFFF" w:sz="0"/>
@@ -17029,7 +17029,7 @@
         </w:tc>
         <w:tc>
           <w:tcPr>
-            <w:tcW w:type="dxa" w:w="2377"/>
+            <w:tcW w:type="dxa" w:w="2402"/>
             <w:tcBorders>
               <w:top w:val="none" w:color="FFFFFF" w:sz="0"/>
               <w:left w:val="none" w:color="FFFFFF" w:sz="0"/>
@@ -17061,7 +17061,7 @@
         </w:tc>
         <w:tc>
           <w:tcPr>
-            <w:tcW w:type="dxa" w:w="1652"/>
+            <w:tcW w:type="dxa" w:w="1669"/>
             <w:tcBorders>
               <w:top w:val="none" w:color="FFFFFF" w:sz="0"/>
               <w:left w:val="none" w:color="FFFFFF" w:sz="0"/>
@@ -17093,7 +17093,7 @@
         </w:tc>
         <w:tc>
           <w:tcPr>
-            <w:tcW w:type="dxa" w:w="1924"/>
+            <w:tcW w:type="dxa" w:w="1944"/>
             <w:tcBorders>
               <w:top w:val="none" w:color="FFFFFF" w:sz="0"/>
               <w:left w:val="none" w:color="FFFFFF" w:sz="0"/>
@@ -17125,7 +17125,7 @@
         </w:tc>
         <w:tc>
           <w:tcPr>
-            <w:tcW w:type="dxa" w:w="745"/>
+            <w:tcW w:type="dxa" w:w="753"/>
             <w:tcBorders>
               <w:top w:val="none" w:color="FFFFFF" w:sz="0"/>
               <w:left w:val="none" w:color="FFFFFF" w:sz="0"/>
@@ -17157,7 +17157,7 @@
         </w:tc>
         <w:tc>
           <w:tcPr>
-            <w:tcW w:type="dxa" w:w="836"/>
+            <w:tcW w:type="dxa" w:w="753"/>
             <w:tcBorders>
               <w:top w:val="none" w:color="FFFFFF" w:sz="0"/>
               <w:left w:val="none" w:color="FFFFFF" w:sz="0"/>
@@ -17183,13 +17183,13 @@
                 <w:sz w:val="18"/>
                 <w:szCs w:val="18"/>
               </w:rPr>
-              <w:t xml:space="preserve">pending</w:t>
-            </w:r>
-          </w:p>
-        </w:tc>
-        <w:tc>
-          <w:tcPr>
-            <w:tcW w:type="dxa" w:w="747"/>
+              <w:t xml:space="preserve">R3</w:t>
+            </w:r>
+          </w:p>
+        </w:tc>
+        <w:tc>
+          <w:tcPr>
+            <w:tcW w:type="dxa" w:w="752"/>
             <w:tcBorders>
               <w:top w:val="none" w:color="FFFFFF" w:sz="0"/>
               <w:left w:val="none" w:color="FFFFFF" w:sz="0"/>
@@ -17226,7 +17226,7 @@
         </w:trPr>
         <w:tc>
           <w:tcPr>
-            <w:tcW w:type="dxa" w:w="745"/>
+            <w:tcW w:type="dxa" w:w="753"/>
             <w:tcBorders>
               <w:top w:val="none" w:color="FFFFFF" w:sz="0"/>
               <w:left w:val="none" w:color="FFFFFF" w:sz="0"/>
@@ -17258,7 +17258,7 @@
         </w:tc>
         <w:tc>
           <w:tcPr>
-            <w:tcW w:type="dxa" w:w="2377"/>
+            <w:tcW w:type="dxa" w:w="2402"/>
             <w:tcBorders>
               <w:top w:val="none" w:color="FFFFFF" w:sz="0"/>
               <w:left w:val="none" w:color="FFFFFF" w:sz="0"/>
@@ -17290,7 +17290,7 @@
         </w:tc>
         <w:tc>
           <w:tcPr>
-            <w:tcW w:type="dxa" w:w="1652"/>
+            <w:tcW w:type="dxa" w:w="1669"/>
             <w:tcBorders>
               <w:top w:val="none" w:color="FFFFFF" w:sz="0"/>
               <w:left w:val="none" w:color="FFFFFF" w:sz="0"/>
@@ -17322,7 +17322,7 @@
         </w:tc>
         <w:tc>
           <w:tcPr>
-            <w:tcW w:type="dxa" w:w="1924"/>
+            <w:tcW w:type="dxa" w:w="1944"/>
             <w:tcBorders>
               <w:top w:val="none" w:color="FFFFFF" w:sz="0"/>
               <w:left w:val="none" w:color="FFFFFF" w:sz="0"/>
@@ -17354,7 +17354,7 @@
         </w:tc>
         <w:tc>
           <w:tcPr>
-            <w:tcW w:type="dxa" w:w="745"/>
+            <w:tcW w:type="dxa" w:w="753"/>
             <w:tcBorders>
               <w:top w:val="none" w:color="FFFFFF" w:sz="0"/>
               <w:left w:val="none" w:color="FFFFFF" w:sz="0"/>
@@ -17386,7 +17386,7 @@
         </w:tc>
         <w:tc>
           <w:tcPr>
-            <w:tcW w:type="dxa" w:w="836"/>
+            <w:tcW w:type="dxa" w:w="753"/>
             <w:tcBorders>
               <w:top w:val="none" w:color="FFFFFF" w:sz="0"/>
               <w:left w:val="none" w:color="FFFFFF" w:sz="0"/>
@@ -17412,13 +17412,13 @@
                 <w:sz w:val="18"/>
                 <w:szCs w:val="18"/>
               </w:rPr>
-              <w:t xml:space="preserve">pending</w:t>
-            </w:r>
-          </w:p>
-        </w:tc>
-        <w:tc>
-          <w:tcPr>
-            <w:tcW w:type="dxa" w:w="747"/>
+              <w:t xml:space="preserve">R3</w:t>
+            </w:r>
+          </w:p>
+        </w:tc>
+        <w:tc>
+          <w:tcPr>
+            <w:tcW w:type="dxa" w:w="752"/>
             <w:tcBorders>
               <w:top w:val="none" w:color="FFFFFF" w:sz="0"/>
               <w:left w:val="none" w:color="FFFFFF" w:sz="0"/>
@@ -17455,7 +17455,7 @@
         </w:trPr>
         <w:tc>
           <w:tcPr>
-            <w:tcW w:type="dxa" w:w="745"/>
+            <w:tcW w:type="dxa" w:w="753"/>
             <w:tcBorders>
               <w:top w:val="none" w:color="FFFFFF" w:sz="0"/>
               <w:left w:val="none" w:color="FFFFFF" w:sz="0"/>
@@ -17487,7 +17487,7 @@
         </w:tc>
         <w:tc>
           <w:tcPr>
-            <w:tcW w:type="dxa" w:w="2377"/>
+            <w:tcW w:type="dxa" w:w="2402"/>
             <w:tcBorders>
               <w:top w:val="none" w:color="FFFFFF" w:sz="0"/>
               <w:left w:val="none" w:color="FFFFFF" w:sz="0"/>
@@ -17519,7 +17519,7 @@
         </w:tc>
         <w:tc>
           <w:tcPr>
-            <w:tcW w:type="dxa" w:w="1652"/>
+            <w:tcW w:type="dxa" w:w="1669"/>
             <w:tcBorders>
               <w:top w:val="none" w:color="FFFFFF" w:sz="0"/>
               <w:left w:val="none" w:color="FFFFFF" w:sz="0"/>
@@ -17551,7 +17551,7 @@
         </w:tc>
         <w:tc>
           <w:tcPr>
-            <w:tcW w:type="dxa" w:w="1924"/>
+            <w:tcW w:type="dxa" w:w="1944"/>
             <w:tcBorders>
               <w:top w:val="none" w:color="FFFFFF" w:sz="0"/>
               <w:left w:val="none" w:color="FFFFFF" w:sz="0"/>
@@ -17583,7 +17583,7 @@
         </w:tc>
         <w:tc>
           <w:tcPr>
-            <w:tcW w:type="dxa" w:w="745"/>
+            <w:tcW w:type="dxa" w:w="753"/>
             <w:tcBorders>
               <w:top w:val="none" w:color="FFFFFF" w:sz="0"/>
               <w:left w:val="none" w:color="FFFFFF" w:sz="0"/>
@@ -17615,7 +17615,7 @@
         </w:tc>
         <w:tc>
           <w:tcPr>
-            <w:tcW w:type="dxa" w:w="836"/>
+            <w:tcW w:type="dxa" w:w="753"/>
             <w:tcBorders>
               <w:top w:val="none" w:color="FFFFFF" w:sz="0"/>
               <w:left w:val="none" w:color="FFFFFF" w:sz="0"/>
@@ -17641,13 +17641,13 @@
                 <w:sz w:val="18"/>
                 <w:szCs w:val="18"/>
               </w:rPr>
-              <w:t xml:space="preserve">pending</w:t>
-            </w:r>
-          </w:p>
-        </w:tc>
-        <w:tc>
-          <w:tcPr>
-            <w:tcW w:type="dxa" w:w="747"/>
+              <w:t xml:space="preserve">R4</w:t>
+            </w:r>
+          </w:p>
+        </w:tc>
+        <w:tc>
+          <w:tcPr>
+            <w:tcW w:type="dxa" w:w="752"/>
             <w:tcBorders>
               <w:top w:val="none" w:color="FFFFFF" w:sz="0"/>
               <w:left w:val="none" w:color="FFFFFF" w:sz="0"/>
@@ -17684,7 +17684,7 @@
         </w:trPr>
         <w:tc>
           <w:tcPr>
-            <w:tcW w:type="dxa" w:w="745"/>
+            <w:tcW w:type="dxa" w:w="753"/>
             <w:tcBorders>
               <w:top w:val="none" w:color="FFFFFF" w:sz="0"/>
               <w:left w:val="none" w:color="FFFFFF" w:sz="0"/>
@@ -17716,7 +17716,7 @@
         </w:tc>
         <w:tc>
           <w:tcPr>
-            <w:tcW w:type="dxa" w:w="2377"/>
+            <w:tcW w:type="dxa" w:w="2402"/>
             <w:tcBorders>
               <w:top w:val="none" w:color="FFFFFF" w:sz="0"/>
               <w:left w:val="none" w:color="FFFFFF" w:sz="0"/>
@@ -17748,7 +17748,7 @@
         </w:tc>
         <w:tc>
           <w:tcPr>
-            <w:tcW w:type="dxa" w:w="1652"/>
+            <w:tcW w:type="dxa" w:w="1669"/>
             <w:tcBorders>
               <w:top w:val="none" w:color="FFFFFF" w:sz="0"/>
               <w:left w:val="none" w:color="FFFFFF" w:sz="0"/>
@@ -17780,7 +17780,7 @@
         </w:tc>
         <w:tc>
           <w:tcPr>
-            <w:tcW w:type="dxa" w:w="1924"/>
+            <w:tcW w:type="dxa" w:w="1944"/>
             <w:tcBorders>
               <w:top w:val="none" w:color="FFFFFF" w:sz="0"/>
               <w:left w:val="none" w:color="FFFFFF" w:sz="0"/>
@@ -17812,7 +17812,7 @@
         </w:tc>
         <w:tc>
           <w:tcPr>
-            <w:tcW w:type="dxa" w:w="745"/>
+            <w:tcW w:type="dxa" w:w="753"/>
             <w:tcBorders>
               <w:top w:val="none" w:color="FFFFFF" w:sz="0"/>
               <w:left w:val="none" w:color="FFFFFF" w:sz="0"/>
@@ -17844,7 +17844,7 @@
         </w:tc>
         <w:tc>
           <w:tcPr>
-            <w:tcW w:type="dxa" w:w="836"/>
+            <w:tcW w:type="dxa" w:w="753"/>
             <w:tcBorders>
               <w:top w:val="none" w:color="FFFFFF" w:sz="0"/>
               <w:left w:val="none" w:color="FFFFFF" w:sz="0"/>
@@ -17870,13 +17870,13 @@
                 <w:sz w:val="18"/>
                 <w:szCs w:val="18"/>
               </w:rPr>
-              <w:t xml:space="preserve">pending</w:t>
-            </w:r>
-          </w:p>
-        </w:tc>
-        <w:tc>
-          <w:tcPr>
-            <w:tcW w:type="dxa" w:w="747"/>
+              <w:t xml:space="preserve">R4</w:t>
+            </w:r>
+          </w:p>
+        </w:tc>
+        <w:tc>
+          <w:tcPr>
+            <w:tcW w:type="dxa" w:w="752"/>
             <w:tcBorders>
               <w:top w:val="none" w:color="FFFFFF" w:sz="0"/>
               <w:left w:val="none" w:color="FFFFFF" w:sz="0"/>
@@ -17913,7 +17913,7 @@
         </w:trPr>
         <w:tc>
           <w:tcPr>
-            <w:tcW w:type="dxa" w:w="745"/>
+            <w:tcW w:type="dxa" w:w="753"/>
             <w:tcBorders>
               <w:top w:val="none" w:color="FFFFFF" w:sz="0"/>
               <w:left w:val="none" w:color="FFFFFF" w:sz="0"/>
@@ -17945,7 +17945,7 @@
         </w:tc>
         <w:tc>
           <w:tcPr>
-            <w:tcW w:type="dxa" w:w="2377"/>
+            <w:tcW w:type="dxa" w:w="2402"/>
             <w:tcBorders>
               <w:top w:val="none" w:color="FFFFFF" w:sz="0"/>
               <w:left w:val="none" w:color="FFFFFF" w:sz="0"/>
@@ -17977,7 +17977,7 @@
         </w:tc>
         <w:tc>
           <w:tcPr>
-            <w:tcW w:type="dxa" w:w="1652"/>
+            <w:tcW w:type="dxa" w:w="1669"/>
             <w:tcBorders>
               <w:top w:val="none" w:color="FFFFFF" w:sz="0"/>
               <w:left w:val="none" w:color="FFFFFF" w:sz="0"/>
@@ -18009,7 +18009,7 @@
         </w:tc>
         <w:tc>
           <w:tcPr>
-            <w:tcW w:type="dxa" w:w="1924"/>
+            <w:tcW w:type="dxa" w:w="1944"/>
             <w:tcBorders>
               <w:top w:val="none" w:color="FFFFFF" w:sz="0"/>
               <w:left w:val="none" w:color="FFFFFF" w:sz="0"/>
@@ -18041,7 +18041,7 @@
         </w:tc>
         <w:tc>
           <w:tcPr>
-            <w:tcW w:type="dxa" w:w="745"/>
+            <w:tcW w:type="dxa" w:w="753"/>
             <w:tcBorders>
               <w:top w:val="none" w:color="FFFFFF" w:sz="0"/>
               <w:left w:val="none" w:color="FFFFFF" w:sz="0"/>
@@ -18073,7 +18073,7 @@
         </w:tc>
         <w:tc>
           <w:tcPr>
-            <w:tcW w:type="dxa" w:w="836"/>
+            <w:tcW w:type="dxa" w:w="753"/>
             <w:tcBorders>
               <w:top w:val="none" w:color="FFFFFF" w:sz="0"/>
               <w:left w:val="none" w:color="FFFFFF" w:sz="0"/>
@@ -18099,13 +18099,13 @@
                 <w:sz w:val="18"/>
                 <w:szCs w:val="18"/>
               </w:rPr>
-              <w:t xml:space="preserve">pending</w:t>
-            </w:r>
-          </w:p>
-        </w:tc>
-        <w:tc>
-          <w:tcPr>
-            <w:tcW w:type="dxa" w:w="747"/>
+              <w:t xml:space="preserve">R4</w:t>
+            </w:r>
+          </w:p>
+        </w:tc>
+        <w:tc>
+          <w:tcPr>
+            <w:tcW w:type="dxa" w:w="752"/>
             <w:tcBorders>
               <w:top w:val="none" w:color="FFFFFF" w:sz="0"/>
               <w:left w:val="none" w:color="FFFFFF" w:sz="0"/>
@@ -18142,7 +18142,7 @@
         </w:trPr>
         <w:tc>
           <w:tcPr>
-            <w:tcW w:type="dxa" w:w="745"/>
+            <w:tcW w:type="dxa" w:w="753"/>
             <w:tcBorders>
               <w:top w:val="none" w:color="FFFFFF" w:sz="0"/>
               <w:left w:val="none" w:color="FFFFFF" w:sz="0"/>
@@ -18174,7 +18174,7 @@
         </w:tc>
         <w:tc>
           <w:tcPr>
-            <w:tcW w:type="dxa" w:w="2377"/>
+            <w:tcW w:type="dxa" w:w="2402"/>
             <w:tcBorders>
               <w:top w:val="none" w:color="FFFFFF" w:sz="0"/>
               <w:left w:val="none" w:color="FFFFFF" w:sz="0"/>
@@ -18206,7 +18206,7 @@
         </w:tc>
         <w:tc>
           <w:tcPr>
-            <w:tcW w:type="dxa" w:w="1652"/>
+            <w:tcW w:type="dxa" w:w="1669"/>
             <w:tcBorders>
               <w:top w:val="none" w:color="FFFFFF" w:sz="0"/>
               <w:left w:val="none" w:color="FFFFFF" w:sz="0"/>
@@ -18238,7 +18238,7 @@
         </w:tc>
         <w:tc>
           <w:tcPr>
-            <w:tcW w:type="dxa" w:w="1924"/>
+            <w:tcW w:type="dxa" w:w="1944"/>
             <w:tcBorders>
               <w:top w:val="none" w:color="FFFFFF" w:sz="0"/>
               <w:left w:val="none" w:color="FFFFFF" w:sz="0"/>
@@ -18270,7 +18270,7 @@
         </w:tc>
         <w:tc>
           <w:tcPr>
-            <w:tcW w:type="dxa" w:w="745"/>
+            <w:tcW w:type="dxa" w:w="753"/>
             <w:tcBorders>
               <w:top w:val="none" w:color="FFFFFF" w:sz="0"/>
               <w:left w:val="none" w:color="FFFFFF" w:sz="0"/>
@@ -18302,7 +18302,7 @@
         </w:tc>
         <w:tc>
           <w:tcPr>
-            <w:tcW w:type="dxa" w:w="836"/>
+            <w:tcW w:type="dxa" w:w="753"/>
             <w:tcBorders>
               <w:top w:val="none" w:color="FFFFFF" w:sz="0"/>
               <w:left w:val="none" w:color="FFFFFF" w:sz="0"/>
@@ -18328,13 +18328,13 @@
                 <w:sz w:val="18"/>
                 <w:szCs w:val="18"/>
               </w:rPr>
-              <w:t xml:space="preserve">pending</w:t>
-            </w:r>
-          </w:p>
-        </w:tc>
-        <w:tc>
-          <w:tcPr>
-            <w:tcW w:type="dxa" w:w="747"/>
+              <w:t xml:space="preserve">R4</w:t>
+            </w:r>
+          </w:p>
+        </w:tc>
+        <w:tc>
+          <w:tcPr>
+            <w:tcW w:type="dxa" w:w="752"/>
             <w:tcBorders>
               <w:top w:val="none" w:color="FFFFFF" w:sz="0"/>
               <w:left w:val="none" w:color="FFFFFF" w:sz="0"/>
@@ -18371,7 +18371,7 @@
         </w:trPr>
         <w:tc>
           <w:tcPr>
-            <w:tcW w:type="dxa" w:w="745"/>
+            <w:tcW w:type="dxa" w:w="753"/>
             <w:tcBorders>
               <w:top w:val="none" w:color="FFFFFF" w:sz="0"/>
               <w:left w:val="none" w:color="FFFFFF" w:sz="0"/>
@@ -18403,7 +18403,7 @@
         </w:tc>
         <w:tc>
           <w:tcPr>
-            <w:tcW w:type="dxa" w:w="2377"/>
+            <w:tcW w:type="dxa" w:w="2402"/>
             <w:tcBorders>
               <w:top w:val="none" w:color="FFFFFF" w:sz="0"/>
               <w:left w:val="none" w:color="FFFFFF" w:sz="0"/>
@@ -18435,7 +18435,7 @@
         </w:tc>
         <w:tc>
           <w:tcPr>
-            <w:tcW w:type="dxa" w:w="1652"/>
+            <w:tcW w:type="dxa" w:w="1669"/>
             <w:tcBorders>
               <w:top w:val="none" w:color="FFFFFF" w:sz="0"/>
               <w:left w:val="none" w:color="FFFFFF" w:sz="0"/>
@@ -18467,7 +18467,7 @@
         </w:tc>
         <w:tc>
           <w:tcPr>
-            <w:tcW w:type="dxa" w:w="1924"/>
+            <w:tcW w:type="dxa" w:w="1944"/>
             <w:tcBorders>
               <w:top w:val="none" w:color="FFFFFF" w:sz="0"/>
               <w:left w:val="none" w:color="FFFFFF" w:sz="0"/>
@@ -18499,7 +18499,7 @@
         </w:tc>
         <w:tc>
           <w:tcPr>
-            <w:tcW w:type="dxa" w:w="745"/>
+            <w:tcW w:type="dxa" w:w="753"/>
             <w:tcBorders>
               <w:top w:val="none" w:color="FFFFFF" w:sz="0"/>
               <w:left w:val="none" w:color="FFFFFF" w:sz="0"/>
@@ -18531,7 +18531,7 @@
         </w:tc>
         <w:tc>
           <w:tcPr>
-            <w:tcW w:type="dxa" w:w="836"/>
+            <w:tcW w:type="dxa" w:w="753"/>
             <w:tcBorders>
               <w:top w:val="none" w:color="FFFFFF" w:sz="0"/>
               <w:left w:val="none" w:color="FFFFFF" w:sz="0"/>
@@ -18557,13 +18557,13 @@
                 <w:sz w:val="18"/>
                 <w:szCs w:val="18"/>
               </w:rPr>
-              <w:t xml:space="preserve">pending</w:t>
-            </w:r>
-          </w:p>
-        </w:tc>
-        <w:tc>
-          <w:tcPr>
-            <w:tcW w:type="dxa" w:w="747"/>
+              <w:t xml:space="preserve">R4</w:t>
+            </w:r>
+          </w:p>
+        </w:tc>
+        <w:tc>
+          <w:tcPr>
+            <w:tcW w:type="dxa" w:w="752"/>
             <w:tcBorders>
               <w:top w:val="none" w:color="FFFFFF" w:sz="0"/>
               <w:left w:val="none" w:color="FFFFFF" w:sz="0"/>
@@ -18600,7 +18600,7 @@
         </w:trPr>
         <w:tc>
           <w:tcPr>
-            <w:tcW w:type="dxa" w:w="745"/>
+            <w:tcW w:type="dxa" w:w="753"/>
             <w:tcBorders>
               <w:top w:val="none" w:color="FFFFFF" w:sz="0"/>
               <w:left w:val="none" w:color="FFFFFF" w:sz="0"/>
@@ -18632,7 +18632,7 @@
         </w:tc>
         <w:tc>
           <w:tcPr>
-            <w:tcW w:type="dxa" w:w="2377"/>
+            <w:tcW w:type="dxa" w:w="2402"/>
             <w:tcBorders>
               <w:top w:val="none" w:color="FFFFFF" w:sz="0"/>
               <w:left w:val="none" w:color="FFFFFF" w:sz="0"/>
@@ -18664,7 +18664,7 @@
         </w:tc>
         <w:tc>
           <w:tcPr>
-            <w:tcW w:type="dxa" w:w="1652"/>
+            <w:tcW w:type="dxa" w:w="1669"/>
             <w:tcBorders>
               <w:top w:val="none" w:color="FFFFFF" w:sz="0"/>
               <w:left w:val="none" w:color="FFFFFF" w:sz="0"/>
@@ -18696,7 +18696,7 @@
         </w:tc>
         <w:tc>
           <w:tcPr>
-            <w:tcW w:type="dxa" w:w="1924"/>
+            <w:tcW w:type="dxa" w:w="1944"/>
             <w:tcBorders>
               <w:top w:val="none" w:color="FFFFFF" w:sz="0"/>
               <w:left w:val="none" w:color="FFFFFF" w:sz="0"/>
@@ -18728,7 +18728,7 @@
         </w:tc>
         <w:tc>
           <w:tcPr>
-            <w:tcW w:type="dxa" w:w="745"/>
+            <w:tcW w:type="dxa" w:w="753"/>
             <w:tcBorders>
               <w:top w:val="none" w:color="FFFFFF" w:sz="0"/>
               <w:left w:val="none" w:color="FFFFFF" w:sz="0"/>
@@ -18760,7 +18760,7 @@
         </w:tc>
         <w:tc>
           <w:tcPr>
-            <w:tcW w:type="dxa" w:w="836"/>
+            <w:tcW w:type="dxa" w:w="753"/>
             <w:tcBorders>
               <w:top w:val="none" w:color="FFFFFF" w:sz="0"/>
               <w:left w:val="none" w:color="FFFFFF" w:sz="0"/>
@@ -18786,13 +18786,13 @@
                 <w:sz w:val="18"/>
                 <w:szCs w:val="18"/>
               </w:rPr>
-              <w:t xml:space="preserve">pending</w:t>
-            </w:r>
-          </w:p>
-        </w:tc>
-        <w:tc>
-          <w:tcPr>
-            <w:tcW w:type="dxa" w:w="747"/>
+              <w:t xml:space="preserve">R4</w:t>
+            </w:r>
+          </w:p>
+        </w:tc>
+        <w:tc>
+          <w:tcPr>
+            <w:tcW w:type="dxa" w:w="752"/>
             <w:tcBorders>
               <w:top w:val="none" w:color="FFFFFF" w:sz="0"/>
               <w:left w:val="none" w:color="FFFFFF" w:sz="0"/>
@@ -18829,7 +18829,7 @@
         </w:trPr>
         <w:tc>
           <w:tcPr>
-            <w:tcW w:type="dxa" w:w="745"/>
+            <w:tcW w:type="dxa" w:w="753"/>
             <w:tcBorders>
               <w:top w:val="none" w:color="FFFFFF" w:sz="0"/>
               <w:left w:val="none" w:color="FFFFFF" w:sz="0"/>
@@ -18861,7 +18861,7 @@
         </w:tc>
         <w:tc>
           <w:tcPr>
-            <w:tcW w:type="dxa" w:w="2377"/>
+            <w:tcW w:type="dxa" w:w="2402"/>
             <w:tcBorders>
               <w:top w:val="none" w:color="FFFFFF" w:sz="0"/>
               <w:left w:val="none" w:color="FFFFFF" w:sz="0"/>
@@ -18893,7 +18893,7 @@
         </w:tc>
         <w:tc>
           <w:tcPr>
-            <w:tcW w:type="dxa" w:w="1652"/>
+            <w:tcW w:type="dxa" w:w="1669"/>
             <w:tcBorders>
               <w:top w:val="none" w:color="FFFFFF" w:sz="0"/>
               <w:left w:val="none" w:color="FFFFFF" w:sz="0"/>
@@ -18925,7 +18925,7 @@
         </w:tc>
         <w:tc>
           <w:tcPr>
-            <w:tcW w:type="dxa" w:w="1924"/>
+            <w:tcW w:type="dxa" w:w="1944"/>
             <w:tcBorders>
               <w:top w:val="none" w:color="FFFFFF" w:sz="0"/>
               <w:left w:val="none" w:color="FFFFFF" w:sz="0"/>
@@ -18957,7 +18957,7 @@
         </w:tc>
         <w:tc>
           <w:tcPr>
-            <w:tcW w:type="dxa" w:w="745"/>
+            <w:tcW w:type="dxa" w:w="753"/>
             <w:tcBorders>
               <w:top w:val="none" w:color="FFFFFF" w:sz="0"/>
               <w:left w:val="none" w:color="FFFFFF" w:sz="0"/>
@@ -18989,7 +18989,7 @@
         </w:tc>
         <w:tc>
           <w:tcPr>
-            <w:tcW w:type="dxa" w:w="836"/>
+            <w:tcW w:type="dxa" w:w="753"/>
             <w:tcBorders>
               <w:top w:val="none" w:color="FFFFFF" w:sz="0"/>
               <w:left w:val="none" w:color="FFFFFF" w:sz="0"/>
@@ -19015,13 +19015,13 @@
                 <w:sz w:val="18"/>
                 <w:szCs w:val="18"/>
               </w:rPr>
-              <w:t xml:space="preserve">pending</w:t>
-            </w:r>
-          </w:p>
-        </w:tc>
-        <w:tc>
-          <w:tcPr>
-            <w:tcW w:type="dxa" w:w="747"/>
+              <w:t xml:space="preserve">R4</w:t>
+            </w:r>
+          </w:p>
+        </w:tc>
+        <w:tc>
+          <w:tcPr>
+            <w:tcW w:type="dxa" w:w="752"/>
             <w:tcBorders>
               <w:top w:val="none" w:color="FFFFFF" w:sz="0"/>
               <w:left w:val="none" w:color="FFFFFF" w:sz="0"/>
@@ -19058,7 +19058,7 @@
         </w:trPr>
         <w:tc>
           <w:tcPr>
-            <w:tcW w:type="dxa" w:w="745"/>
+            <w:tcW w:type="dxa" w:w="753"/>
             <w:tcBorders>
               <w:top w:val="none" w:color="FFFFFF" w:sz="0"/>
               <w:left w:val="none" w:color="FFFFFF" w:sz="0"/>
@@ -19090,7 +19090,7 @@
         </w:tc>
         <w:tc>
           <w:tcPr>
-            <w:tcW w:type="dxa" w:w="2377"/>
+            <w:tcW w:type="dxa" w:w="2402"/>
             <w:tcBorders>
               <w:top w:val="none" w:color="FFFFFF" w:sz="0"/>
               <w:left w:val="none" w:color="FFFFFF" w:sz="0"/>
@@ -19122,7 +19122,7 @@
         </w:tc>
         <w:tc>
           <w:tcPr>
-            <w:tcW w:type="dxa" w:w="1652"/>
+            <w:tcW w:type="dxa" w:w="1669"/>
             <w:tcBorders>
               <w:top w:val="none" w:color="FFFFFF" w:sz="0"/>
               <w:left w:val="none" w:color="FFFFFF" w:sz="0"/>
@@ -19154,7 +19154,7 @@
         </w:tc>
         <w:tc>
           <w:tcPr>
-            <w:tcW w:type="dxa" w:w="1924"/>
+            <w:tcW w:type="dxa" w:w="1944"/>
             <w:tcBorders>
               <w:top w:val="none" w:color="FFFFFF" w:sz="0"/>
               <w:left w:val="none" w:color="FFFFFF" w:sz="0"/>
@@ -19186,7 +19186,7 @@
         </w:tc>
         <w:tc>
           <w:tcPr>
-            <w:tcW w:type="dxa" w:w="745"/>
+            <w:tcW w:type="dxa" w:w="753"/>
             <w:tcBorders>
               <w:top w:val="none" w:color="FFFFFF" w:sz="0"/>
               <w:left w:val="none" w:color="FFFFFF" w:sz="0"/>
@@ -19218,7 +19218,7 @@
         </w:tc>
         <w:tc>
           <w:tcPr>
-            <w:tcW w:type="dxa" w:w="836"/>
+            <w:tcW w:type="dxa" w:w="753"/>
             <w:tcBorders>
               <w:top w:val="none" w:color="FFFFFF" w:sz="0"/>
               <w:left w:val="none" w:color="FFFFFF" w:sz="0"/>
@@ -19244,13 +19244,13 @@
                 <w:sz w:val="18"/>
                 <w:szCs w:val="18"/>
               </w:rPr>
-              <w:t xml:space="preserve">pending</w:t>
-            </w:r>
-          </w:p>
-        </w:tc>
-        <w:tc>
-          <w:tcPr>
-            <w:tcW w:type="dxa" w:w="747"/>
+              <w:t xml:space="preserve">R4</w:t>
+            </w:r>
+          </w:p>
+        </w:tc>
+        <w:tc>
+          <w:tcPr>
+            <w:tcW w:type="dxa" w:w="752"/>
             <w:tcBorders>
               <w:top w:val="none" w:color="FFFFFF" w:sz="0"/>
               <w:left w:val="none" w:color="FFFFFF" w:sz="0"/>
@@ -19287,7 +19287,7 @@
         </w:trPr>
         <w:tc>
           <w:tcPr>
-            <w:tcW w:type="dxa" w:w="745"/>
+            <w:tcW w:type="dxa" w:w="753"/>
             <w:tcBorders>
               <w:top w:val="none" w:color="FFFFFF" w:sz="0"/>
               <w:left w:val="none" w:color="FFFFFF" w:sz="0"/>
@@ -19319,7 +19319,7 @@
         </w:tc>
         <w:tc>
           <w:tcPr>
-            <w:tcW w:type="dxa" w:w="2377"/>
+            <w:tcW w:type="dxa" w:w="2402"/>
             <w:tcBorders>
               <w:top w:val="none" w:color="FFFFFF" w:sz="0"/>
               <w:left w:val="none" w:color="FFFFFF" w:sz="0"/>
@@ -19351,7 +19351,7 @@
         </w:tc>
         <w:tc>
           <w:tcPr>
-            <w:tcW w:type="dxa" w:w="1652"/>
+            <w:tcW w:type="dxa" w:w="1669"/>
             <w:tcBorders>
               <w:top w:val="none" w:color="FFFFFF" w:sz="0"/>
               <w:left w:val="none" w:color="FFFFFF" w:sz="0"/>
@@ -19383,7 +19383,7 @@
         </w:tc>
         <w:tc>
           <w:tcPr>
-            <w:tcW w:type="dxa" w:w="1924"/>
+            <w:tcW w:type="dxa" w:w="1944"/>
             <w:tcBorders>
               <w:top w:val="none" w:color="FFFFFF" w:sz="0"/>
               <w:left w:val="none" w:color="FFFFFF" w:sz="0"/>
@@ -19415,7 +19415,7 @@
         </w:tc>
         <w:tc>
           <w:tcPr>
-            <w:tcW w:type="dxa" w:w="745"/>
+            <w:tcW w:type="dxa" w:w="753"/>
             <w:tcBorders>
               <w:top w:val="none" w:color="FFFFFF" w:sz="0"/>
               <w:left w:val="none" w:color="FFFFFF" w:sz="0"/>
@@ -19447,7 +19447,7 @@
         </w:tc>
         <w:tc>
           <w:tcPr>
-            <w:tcW w:type="dxa" w:w="836"/>
+            <w:tcW w:type="dxa" w:w="753"/>
             <w:tcBorders>
               <w:top w:val="none" w:color="FFFFFF" w:sz="0"/>
               <w:left w:val="none" w:color="FFFFFF" w:sz="0"/>
@@ -19473,13 +19473,13 @@
                 <w:sz w:val="18"/>
                 <w:szCs w:val="18"/>
               </w:rPr>
-              <w:t xml:space="preserve">pending</w:t>
-            </w:r>
-          </w:p>
-        </w:tc>
-        <w:tc>
-          <w:tcPr>
-            <w:tcW w:type="dxa" w:w="747"/>
+              <w:t xml:space="preserve">R4</w:t>
+            </w:r>
+          </w:p>
+        </w:tc>
+        <w:tc>
+          <w:tcPr>
+            <w:tcW w:type="dxa" w:w="752"/>
             <w:tcBorders>
               <w:top w:val="none" w:color="FFFFFF" w:sz="0"/>
               <w:left w:val="none" w:color="FFFFFF" w:sz="0"/>
@@ -19516,7 +19516,7 @@
         </w:trPr>
         <w:tc>
           <w:tcPr>
-            <w:tcW w:type="dxa" w:w="745"/>
+            <w:tcW w:type="dxa" w:w="753"/>
             <w:tcBorders>
               <w:top w:val="none" w:color="FFFFFF" w:sz="0"/>
               <w:left w:val="none" w:color="FFFFFF" w:sz="0"/>
@@ -19548,7 +19548,7 @@
         </w:tc>
         <w:tc>
           <w:tcPr>
-            <w:tcW w:type="dxa" w:w="2377"/>
+            <w:tcW w:type="dxa" w:w="2402"/>
             <w:tcBorders>
               <w:top w:val="none" w:color="FFFFFF" w:sz="0"/>
               <w:left w:val="none" w:color="FFFFFF" w:sz="0"/>
@@ -19580,7 +19580,7 @@
         </w:tc>
         <w:tc>
           <w:tcPr>
-            <w:tcW w:type="dxa" w:w="1652"/>
+            <w:tcW w:type="dxa" w:w="1669"/>
             <w:tcBorders>
               <w:top w:val="none" w:color="FFFFFF" w:sz="0"/>
               <w:left w:val="none" w:color="FFFFFF" w:sz="0"/>
@@ -19612,7 +19612,7 @@
         </w:tc>
         <w:tc>
           <w:tcPr>
-            <w:tcW w:type="dxa" w:w="1924"/>
+            <w:tcW w:type="dxa" w:w="1944"/>
             <w:tcBorders>
               <w:top w:val="none" w:color="FFFFFF" w:sz="0"/>
               <w:left w:val="none" w:color="FFFFFF" w:sz="0"/>
@@ -19644,7 +19644,7 @@
         </w:tc>
         <w:tc>
           <w:tcPr>
-            <w:tcW w:type="dxa" w:w="745"/>
+            <w:tcW w:type="dxa" w:w="753"/>
             <w:tcBorders>
               <w:top w:val="none" w:color="FFFFFF" w:sz="0"/>
               <w:left w:val="none" w:color="FFFFFF" w:sz="0"/>
@@ -19676,7 +19676,7 @@
         </w:tc>
         <w:tc>
           <w:tcPr>
-            <w:tcW w:type="dxa" w:w="836"/>
+            <w:tcW w:type="dxa" w:w="753"/>
             <w:tcBorders>
               <w:top w:val="none" w:color="FFFFFF" w:sz="0"/>
               <w:left w:val="none" w:color="FFFFFF" w:sz="0"/>
@@ -19702,13 +19702,13 @@
                 <w:sz w:val="18"/>
                 <w:szCs w:val="18"/>
               </w:rPr>
-              <w:t xml:space="preserve">pending</w:t>
-            </w:r>
-          </w:p>
-        </w:tc>
-        <w:tc>
-          <w:tcPr>
-            <w:tcW w:type="dxa" w:w="747"/>
+              <w:t xml:space="preserve">R4</w:t>
+            </w:r>
+          </w:p>
+        </w:tc>
+        <w:tc>
+          <w:tcPr>
+            <w:tcW w:type="dxa" w:w="752"/>
             <w:tcBorders>
               <w:top w:val="none" w:color="FFFFFF" w:sz="0"/>
               <w:left w:val="none" w:color="FFFFFF" w:sz="0"/>
@@ -19745,7 +19745,7 @@
         </w:trPr>
         <w:tc>
           <w:tcPr>
-            <w:tcW w:type="dxa" w:w="745"/>
+            <w:tcW w:type="dxa" w:w="753"/>
             <w:tcBorders>
               <w:top w:val="none" w:color="FFFFFF" w:sz="0"/>
               <w:left w:val="none" w:color="FFFFFF" w:sz="0"/>
@@ -19777,7 +19777,7 @@
         </w:tc>
         <w:tc>
           <w:tcPr>
-            <w:tcW w:type="dxa" w:w="2377"/>
+            <w:tcW w:type="dxa" w:w="2402"/>
             <w:tcBorders>
               <w:top w:val="none" w:color="FFFFFF" w:sz="0"/>
               <w:left w:val="none" w:color="FFFFFF" w:sz="0"/>
@@ -19809,7 +19809,7 @@
         </w:tc>
         <w:tc>
           <w:tcPr>
-            <w:tcW w:type="dxa" w:w="1652"/>
+            <w:tcW w:type="dxa" w:w="1669"/>
             <w:tcBorders>
               <w:top w:val="none" w:color="FFFFFF" w:sz="0"/>
               <w:left w:val="none" w:color="FFFFFF" w:sz="0"/>
@@ -19841,7 +19841,7 @@
         </w:tc>
         <w:tc>
           <w:tcPr>
-            <w:tcW w:type="dxa" w:w="1924"/>
+            <w:tcW w:type="dxa" w:w="1944"/>
             <w:tcBorders>
               <w:top w:val="none" w:color="FFFFFF" w:sz="0"/>
               <w:left w:val="none" w:color="FFFFFF" w:sz="0"/>
@@ -19873,7 +19873,7 @@
         </w:tc>
         <w:tc>
           <w:tcPr>
-            <w:tcW w:type="dxa" w:w="745"/>
+            <w:tcW w:type="dxa" w:w="753"/>
             <w:tcBorders>
               <w:top w:val="none" w:color="FFFFFF" w:sz="0"/>
               <w:left w:val="none" w:color="FFFFFF" w:sz="0"/>
@@ -19905,7 +19905,7 @@
         </w:tc>
         <w:tc>
           <w:tcPr>
-            <w:tcW w:type="dxa" w:w="836"/>
+            <w:tcW w:type="dxa" w:w="753"/>
             <w:tcBorders>
               <w:top w:val="none" w:color="FFFFFF" w:sz="0"/>
               <w:left w:val="none" w:color="FFFFFF" w:sz="0"/>
@@ -19931,13 +19931,13 @@
                 <w:sz w:val="18"/>
                 <w:szCs w:val="18"/>
               </w:rPr>
-              <w:t xml:space="preserve">pending</w:t>
-            </w:r>
-          </w:p>
-        </w:tc>
-        <w:tc>
-          <w:tcPr>
-            <w:tcW w:type="dxa" w:w="747"/>
+              <w:t xml:space="preserve">R4</w:t>
+            </w:r>
+          </w:p>
+        </w:tc>
+        <w:tc>
+          <w:tcPr>
+            <w:tcW w:type="dxa" w:w="752"/>
             <w:tcBorders>
               <w:top w:val="none" w:color="FFFFFF" w:sz="0"/>
               <w:left w:val="none" w:color="FFFFFF" w:sz="0"/>
@@ -19974,7 +19974,7 @@
         </w:trPr>
         <w:tc>
           <w:tcPr>
-            <w:tcW w:type="dxa" w:w="745"/>
+            <w:tcW w:type="dxa" w:w="753"/>
             <w:tcBorders>
               <w:top w:val="none" w:color="FFFFFF" w:sz="0"/>
               <w:left w:val="none" w:color="FFFFFF" w:sz="0"/>
@@ -20006,7 +20006,7 @@
         </w:tc>
         <w:tc>
           <w:tcPr>
-            <w:tcW w:type="dxa" w:w="2377"/>
+            <w:tcW w:type="dxa" w:w="2402"/>
             <w:tcBorders>
               <w:top w:val="none" w:color="FFFFFF" w:sz="0"/>
               <w:left w:val="none" w:color="FFFFFF" w:sz="0"/>
@@ -20038,7 +20038,7 @@
         </w:tc>
         <w:tc>
           <w:tcPr>
-            <w:tcW w:type="dxa" w:w="1652"/>
+            <w:tcW w:type="dxa" w:w="1669"/>
             <w:tcBorders>
               <w:top w:val="none" w:color="FFFFFF" w:sz="0"/>
               <w:left w:val="none" w:color="FFFFFF" w:sz="0"/>
@@ -20070,7 +20070,7 @@
         </w:tc>
         <w:tc>
           <w:tcPr>
-            <w:tcW w:type="dxa" w:w="1924"/>
+            <w:tcW w:type="dxa" w:w="1944"/>
             <w:tcBorders>
               <w:top w:val="none" w:color="FFFFFF" w:sz="0"/>
               <w:left w:val="none" w:color="FFFFFF" w:sz="0"/>
@@ -20102,7 +20102,7 @@
         </w:tc>
         <w:tc>
           <w:tcPr>
-            <w:tcW w:type="dxa" w:w="745"/>
+            <w:tcW w:type="dxa" w:w="753"/>
             <w:tcBorders>
               <w:top w:val="none" w:color="FFFFFF" w:sz="0"/>
               <w:left w:val="none" w:color="FFFFFF" w:sz="0"/>
@@ -20134,7 +20134,7 @@
         </w:tc>
         <w:tc>
           <w:tcPr>
-            <w:tcW w:type="dxa" w:w="836"/>
+            <w:tcW w:type="dxa" w:w="753"/>
             <w:tcBorders>
               <w:top w:val="none" w:color="FFFFFF" w:sz="0"/>
               <w:left w:val="none" w:color="FFFFFF" w:sz="0"/>
@@ -20160,13 +20160,13 @@
                 <w:sz w:val="18"/>
                 <w:szCs w:val="18"/>
               </w:rPr>
-              <w:t xml:space="preserve">pending</w:t>
-            </w:r>
-          </w:p>
-        </w:tc>
-        <w:tc>
-          <w:tcPr>
-            <w:tcW w:type="dxa" w:w="747"/>
+              <w:t xml:space="preserve">R4</w:t>
+            </w:r>
+          </w:p>
+        </w:tc>
+        <w:tc>
+          <w:tcPr>
+            <w:tcW w:type="dxa" w:w="752"/>
             <w:tcBorders>
               <w:top w:val="none" w:color="FFFFFF" w:sz="0"/>
               <w:left w:val="none" w:color="FFFFFF" w:sz="0"/>
@@ -20203,7 +20203,7 @@
         </w:trPr>
         <w:tc>
           <w:tcPr>
-            <w:tcW w:type="dxa" w:w="745"/>
+            <w:tcW w:type="dxa" w:w="753"/>
             <w:tcBorders>
               <w:top w:val="none" w:color="FFFFFF" w:sz="0"/>
               <w:left w:val="none" w:color="FFFFFF" w:sz="0"/>
@@ -20235,7 +20235,7 @@
         </w:tc>
         <w:tc>
           <w:tcPr>
-            <w:tcW w:type="dxa" w:w="2377"/>
+            <w:tcW w:type="dxa" w:w="2402"/>
             <w:tcBorders>
               <w:top w:val="none" w:color="FFFFFF" w:sz="0"/>
               <w:left w:val="none" w:color="FFFFFF" w:sz="0"/>
@@ -20267,7 +20267,7 @@
         </w:tc>
         <w:tc>
           <w:tcPr>
-            <w:tcW w:type="dxa" w:w="1652"/>
+            <w:tcW w:type="dxa" w:w="1669"/>
             <w:tcBorders>
               <w:top w:val="none" w:color="FFFFFF" w:sz="0"/>
               <w:left w:val="none" w:color="FFFFFF" w:sz="0"/>
@@ -20299,7 +20299,7 @@
         </w:tc>
         <w:tc>
           <w:tcPr>
-            <w:tcW w:type="dxa" w:w="1924"/>
+            <w:tcW w:type="dxa" w:w="1944"/>
             <w:tcBorders>
               <w:top w:val="none" w:color="FFFFFF" w:sz="0"/>
               <w:left w:val="none" w:color="FFFFFF" w:sz="0"/>
@@ -20331,7 +20331,7 @@
         </w:tc>
         <w:tc>
           <w:tcPr>
-            <w:tcW w:type="dxa" w:w="745"/>
+            <w:tcW w:type="dxa" w:w="753"/>
             <w:tcBorders>
               <w:top w:val="none" w:color="FFFFFF" w:sz="0"/>
               <w:left w:val="none" w:color="FFFFFF" w:sz="0"/>
@@ -20363,7 +20363,7 @@
         </w:tc>
         <w:tc>
           <w:tcPr>
-            <w:tcW w:type="dxa" w:w="836"/>
+            <w:tcW w:type="dxa" w:w="753"/>
             <w:tcBorders>
               <w:top w:val="none" w:color="FFFFFF" w:sz="0"/>
               <w:left w:val="none" w:color="FFFFFF" w:sz="0"/>
@@ -20389,13 +20389,13 @@
                 <w:sz w:val="18"/>
                 <w:szCs w:val="18"/>
               </w:rPr>
-              <w:t xml:space="preserve">pending</w:t>
-            </w:r>
-          </w:p>
-        </w:tc>
-        <w:tc>
-          <w:tcPr>
-            <w:tcW w:type="dxa" w:w="747"/>
+              <w:t xml:space="preserve">R4</w:t>
+            </w:r>
+          </w:p>
+        </w:tc>
+        <w:tc>
+          <w:tcPr>
+            <w:tcW w:type="dxa" w:w="752"/>
             <w:tcBorders>
               <w:top w:val="none" w:color="FFFFFF" w:sz="0"/>
               <w:left w:val="none" w:color="FFFFFF" w:sz="0"/>
@@ -20432,7 +20432,7 @@
         </w:trPr>
         <w:tc>
           <w:tcPr>
-            <w:tcW w:type="dxa" w:w="745"/>
+            <w:tcW w:type="dxa" w:w="753"/>
             <w:tcBorders>
               <w:top w:val="none" w:color="FFFFFF" w:sz="0"/>
               <w:left w:val="none" w:color="FFFFFF" w:sz="0"/>
@@ -20464,7 +20464,7 @@
         </w:tc>
         <w:tc>
           <w:tcPr>
-            <w:tcW w:type="dxa" w:w="2377"/>
+            <w:tcW w:type="dxa" w:w="2402"/>
             <w:tcBorders>
               <w:top w:val="none" w:color="FFFFFF" w:sz="0"/>
               <w:left w:val="none" w:color="FFFFFF" w:sz="0"/>
@@ -20496,7 +20496,7 @@
         </w:tc>
         <w:tc>
           <w:tcPr>
-            <w:tcW w:type="dxa" w:w="1652"/>
+            <w:tcW w:type="dxa" w:w="1669"/>
             <w:tcBorders>
               <w:top w:val="none" w:color="FFFFFF" w:sz="0"/>
               <w:left w:val="none" w:color="FFFFFF" w:sz="0"/>
@@ -20528,7 +20528,7 @@
         </w:tc>
         <w:tc>
           <w:tcPr>
-            <w:tcW w:type="dxa" w:w="1924"/>
+            <w:tcW w:type="dxa" w:w="1944"/>
             <w:tcBorders>
               <w:top w:val="none" w:color="FFFFFF" w:sz="0"/>
               <w:left w:val="none" w:color="FFFFFF" w:sz="0"/>
@@ -20560,7 +20560,7 @@
         </w:tc>
         <w:tc>
           <w:tcPr>
-            <w:tcW w:type="dxa" w:w="745"/>
+            <w:tcW w:type="dxa" w:w="753"/>
             <w:tcBorders>
               <w:top w:val="none" w:color="FFFFFF" w:sz="0"/>
               <w:left w:val="none" w:color="FFFFFF" w:sz="0"/>
@@ -20592,7 +20592,7 @@
         </w:tc>
         <w:tc>
           <w:tcPr>
-            <w:tcW w:type="dxa" w:w="836"/>
+            <w:tcW w:type="dxa" w:w="753"/>
             <w:tcBorders>
               <w:top w:val="none" w:color="FFFFFF" w:sz="0"/>
               <w:left w:val="none" w:color="FFFFFF" w:sz="0"/>
@@ -20618,13 +20618,13 @@
                 <w:sz w:val="18"/>
                 <w:szCs w:val="18"/>
               </w:rPr>
-              <w:t xml:space="preserve">pending</w:t>
-            </w:r>
-          </w:p>
-        </w:tc>
-        <w:tc>
-          <w:tcPr>
-            <w:tcW w:type="dxa" w:w="747"/>
+              <w:t xml:space="preserve">R4</w:t>
+            </w:r>
+          </w:p>
+        </w:tc>
+        <w:tc>
+          <w:tcPr>
+            <w:tcW w:type="dxa" w:w="752"/>
             <w:tcBorders>
               <w:top w:val="none" w:color="FFFFFF" w:sz="0"/>
               <w:left w:val="none" w:color="FFFFFF" w:sz="0"/>

</xml_diff>

<commit_message>
Report: document the model route actually used (OpenRouter, pinned providers)
Also fixes the appendix table writer for missing values in run manifests.

Co-Authored-By: Claude Opus 5.5 <noreply@anthropic.com>
Claude-Session: https://claude.ai/code/session_01FhGwkzQQHbXoS4fbZte9eu
</commit_message>
<xml_diff>
--- a/report/final_report_DRAFT.docx
+++ b/report/final_report_DRAFT.docx
@@ -1395,7 +1395,7 @@
                 <w:sz w:val="20"/>
                 <w:szCs w:val="20"/>
               </w:rPr>
-              <w:t xml:space="preserve">Doubao, DeepSeek, Kimi (via Volcano Ark)</w:t>
+              <w:t xml:space="preserve">Doubao, DeepSeek, Kimi</w:t>
             </w:r>
           </w:p>
         </w:tc>
@@ -6311,7 +6311,7 @@
         <w:rPr>
           <w:rFonts w:ascii="Times New Roman" w:cs="Times New Roman" w:eastAsia="SimSun" w:hAnsi="Times New Roman"/>
         </w:rPr>
-        <w:t xml:space="preserve">Three models from three Chinese developers are audited (Table 6): Doubao-Seed (ByteDance), DeepSeek V4 Flash (DeepSeek) and Kimi (Moonshot AI). All three are reached with one key through the Volcano Engine Ark Agent Plan, the access route specified for the course, using its OpenAI-compatible endpoint with identical messages and settings. Exact identifiers are taken from the plan's model list and recorded with the identifier returned in every response, because hosted models change without notice. Temperature is 0.7 for every model, as in the course's reference script; sampling is therefore stochastic, which the consistency module measures directly.</w:t>
+        <w:t xml:space="preserve">Three models from three Chinese developers are audited (Table 6): Doubao-Seed 2.0 mini (ByteDance), DeepSeek V4 Flash (DeepSeek) and Kimi K2.6 (Moonshot AI). The course specified access through the Volcano Engine Ark Agent Plan. That route could not be used: the keys available to the group were ordinary Ark keys, which the Agent Plan endpoint rejected, and the pay-as-you-go alternative required a verification step the account holder could not complete. The same three model families were therefore called through OpenRouter, an OpenAI-compatible gateway. Each model was pinned to a single serving provider with fallbacks disabled, so every reply for a model comes from the same deployment: ByteDance's own Seed service, Moonshot AI's own service, and SiliconFlow for DeepSeek, for which no first-party provider was offered. Every call uses identical messages and settings, and the provider and model identifier returned with each reply are logged. Temperature is 0.7 for every model, as in the course's reference script, so sampling is stochastic; the consistency module measures this directly. Reasoning modes were disabled for all three models. For Kimi this was done after the pilot, where the model spent its whole output allowance on hidden reasoning and returned no answer; the 20 failed pilot calls remain in the log.</w:t>
       </w:r>
     </w:p>
     <w:p>
@@ -6358,10 +6358,10 @@
         <w:tblLayout w:type="fixed"/>
       </w:tblPr>
       <w:tblGrid>
-        <w:gridCol w:w="1886"/>
-        <w:gridCol w:w="3567"/>
-        <w:gridCol w:w="1693"/>
-        <w:gridCol w:w="1880"/>
+        <w:gridCol w:w="1262"/>
+        <w:gridCol w:w="2912"/>
+        <w:gridCol w:w="2718"/>
+        <w:gridCol w:w="2134"/>
       </w:tblGrid>
       <w:tr>
         <w:trPr>
@@ -6369,7 +6369,7 @@
         </w:trPr>
         <w:tc>
           <w:tcPr>
-            <w:tcW w:type="dxa" w:w="1886"/>
+            <w:tcW w:type="dxa" w:w="1262"/>
             <w:tcBorders>
               <w:top w:val="single" w:color="000000" w:sz="6"/>
               <w:left w:val="none" w:color="FFFFFF" w:sz="0"/>
@@ -6401,7 +6401,7 @@
         </w:tc>
         <w:tc>
           <w:tcPr>
-            <w:tcW w:type="dxa" w:w="3567"/>
+            <w:tcW w:type="dxa" w:w="2912"/>
             <w:tcBorders>
               <w:top w:val="single" w:color="000000" w:sz="6"/>
               <w:left w:val="none" w:color="FFFFFF" w:sz="0"/>
@@ -6433,7 +6433,7 @@
         </w:tc>
         <w:tc>
           <w:tcPr>
-            <w:tcW w:type="dxa" w:w="1693"/>
+            <w:tcW w:type="dxa" w:w="2718"/>
             <w:tcBorders>
               <w:top w:val="single" w:color="000000" w:sz="6"/>
               <w:left w:val="none" w:color="FFFFFF" w:sz="0"/>
@@ -6465,7 +6465,7 @@
         </w:tc>
         <w:tc>
           <w:tcPr>
-            <w:tcW w:type="dxa" w:w="1880"/>
+            <w:tcW w:type="dxa" w:w="2134"/>
             <w:tcBorders>
               <w:top w:val="single" w:color="000000" w:sz="6"/>
               <w:left w:val="none" w:color="FFFFFF" w:sz="0"/>
@@ -6491,7 +6491,7 @@
                 <w:sz w:val="20"/>
                 <w:szCs w:val="20"/>
               </w:rPr>
-              <w:t xml:space="preserve">Kimi (fallback: GLM)</w:t>
+              <w:t xml:space="preserve">Kimi</w:t>
             </w:r>
           </w:p>
         </w:tc>
@@ -6502,7 +6502,7 @@
         </w:trPr>
         <w:tc>
           <w:tcPr>
-            <w:tcW w:type="dxa" w:w="1886"/>
+            <w:tcW w:type="dxa" w:w="1262"/>
             <w:tcBorders>
               <w:top w:val="none" w:color="FFFFFF" w:sz="0"/>
               <w:left w:val="none" w:color="FFFFFF" w:sz="0"/>
@@ -6534,7 +6534,7 @@
         </w:tc>
         <w:tc>
           <w:tcPr>
-            <w:tcW w:type="dxa" w:w="3567"/>
+            <w:tcW w:type="dxa" w:w="2912"/>
             <w:tcBorders>
               <w:top w:val="none" w:color="FFFFFF" w:sz="0"/>
               <w:left w:val="none" w:color="FFFFFF" w:sz="0"/>
@@ -6566,7 +6566,7 @@
         </w:tc>
         <w:tc>
           <w:tcPr>
-            <w:tcW w:type="dxa" w:w="1693"/>
+            <w:tcW w:type="dxa" w:w="2718"/>
             <w:tcBorders>
               <w:top w:val="none" w:color="FFFFFF" w:sz="0"/>
               <w:left w:val="none" w:color="FFFFFF" w:sz="0"/>
@@ -6598,33 +6598,33 @@
         </w:tc>
         <w:tc>
           <w:tcPr>
-            <w:tcW w:type="dxa" w:w="1880"/>
-            <w:tcBorders>
-              <w:top w:val="none" w:color="FFFFFF" w:sz="0"/>
-              <w:left w:val="none" w:color="FFFFFF" w:sz="0"/>
-              <w:bottom w:val="none" w:color="FFFFFF" w:sz="0"/>
-              <w:right w:val="none" w:color="FFFFFF" w:sz="0"/>
-            </w:tcBorders>
-            <w:tcMar>
-              <w:top w:type="dxa" w:w="40"/>
-              <w:left w:type="dxa" w:w="80"/>
-              <w:bottom w:type="dxa" w:w="40"/>
-              <w:right w:type="dxa" w:w="80"/>
-            </w:tcMar>
-          </w:tcPr>
-          <w:p>
-            <w:pPr>
-              <w:spacing w:line="276" w:lineRule="auto"/>
-            </w:pPr>
-            <w:r>
-              <w:rPr>
-                <w:rFonts w:ascii="Times New Roman" w:cs="Times New Roman" w:eastAsia="SimSun" w:hAnsi="Times New Roman"/>
-                <w:b w:val="false"/>
-                <w:bCs w:val="false"/>
-                <w:sz w:val="20"/>
-                <w:szCs w:val="20"/>
-              </w:rPr>
-              <w:t xml:space="preserve">Moonshot AI (Zhipu AI)</w:t>
+            <w:tcW w:type="dxa" w:w="2134"/>
+            <w:tcBorders>
+              <w:top w:val="none" w:color="FFFFFF" w:sz="0"/>
+              <w:left w:val="none" w:color="FFFFFF" w:sz="0"/>
+              <w:bottom w:val="none" w:color="FFFFFF" w:sz="0"/>
+              <w:right w:val="none" w:color="FFFFFF" w:sz="0"/>
+            </w:tcBorders>
+            <w:tcMar>
+              <w:top w:type="dxa" w:w="40"/>
+              <w:left w:type="dxa" w:w="80"/>
+              <w:bottom w:type="dxa" w:w="40"/>
+              <w:right w:type="dxa" w:w="80"/>
+            </w:tcMar>
+          </w:tcPr>
+          <w:p>
+            <w:pPr>
+              <w:spacing w:line="276" w:lineRule="auto"/>
+            </w:pPr>
+            <w:r>
+              <w:rPr>
+                <w:rFonts w:ascii="Times New Roman" w:cs="Times New Roman" w:eastAsia="SimSun" w:hAnsi="Times New Roman"/>
+                <w:b w:val="false"/>
+                <w:bCs w:val="false"/>
+                <w:sz w:val="20"/>
+                <w:szCs w:val="20"/>
+              </w:rPr>
+              <w:t xml:space="preserve">Moonshot AI</w:t>
             </w:r>
           </w:p>
         </w:tc>
@@ -6635,7 +6635,7 @@
         </w:trPr>
         <w:tc>
           <w:tcPr>
-            <w:tcW w:type="dxa" w:w="1886"/>
+            <w:tcW w:type="dxa" w:w="1262"/>
             <w:tcBorders>
               <w:top w:val="none" w:color="FFFFFF" w:sz="0"/>
               <w:left w:val="none" w:color="FFFFFF" w:sz="0"/>
@@ -6667,97 +6667,97 @@
         </w:tc>
         <w:tc>
           <w:tcPr>
-            <w:tcW w:type="dxa" w:w="3567"/>
-            <w:tcBorders>
-              <w:top w:val="none" w:color="FFFFFF" w:sz="0"/>
-              <w:left w:val="none" w:color="FFFFFF" w:sz="0"/>
-              <w:bottom w:val="none" w:color="FFFFFF" w:sz="0"/>
-              <w:right w:val="none" w:color="FFFFFF" w:sz="0"/>
-            </w:tcBorders>
-            <w:tcMar>
-              <w:top w:type="dxa" w:w="40"/>
-              <w:left w:type="dxa" w:w="80"/>
-              <w:bottom w:type="dxa" w:w="40"/>
-              <w:right w:type="dxa" w:w="80"/>
-            </w:tcMar>
-          </w:tcPr>
-          <w:p>
-            <w:pPr>
-              <w:spacing w:line="276" w:lineRule="auto"/>
-            </w:pPr>
-            <w:r>
-              <w:rPr>
-                <w:rFonts w:ascii="Times New Roman" w:cs="Times New Roman" w:eastAsia="SimSun" w:hAnsi="Times New Roman"/>
-                <w:b w:val="false"/>
-                <w:bCs w:val="false"/>
-                <w:sz w:val="20"/>
-                <w:szCs w:val="20"/>
-              </w:rPr>
-              <w:t xml:space="preserve">doubao-seed-2.0-mini, confirmed at run time</w:t>
-            </w:r>
-          </w:p>
-        </w:tc>
-        <w:tc>
-          <w:tcPr>
-            <w:tcW w:type="dxa" w:w="1693"/>
-            <w:tcBorders>
-              <w:top w:val="none" w:color="FFFFFF" w:sz="0"/>
-              <w:left w:val="none" w:color="FFFFFF" w:sz="0"/>
-              <w:bottom w:val="none" w:color="FFFFFF" w:sz="0"/>
-              <w:right w:val="none" w:color="FFFFFF" w:sz="0"/>
-            </w:tcBorders>
-            <w:tcMar>
-              <w:top w:type="dxa" w:w="40"/>
-              <w:left w:type="dxa" w:w="80"/>
-              <w:bottom w:type="dxa" w:w="40"/>
-              <w:right w:type="dxa" w:w="80"/>
-            </w:tcMar>
-          </w:tcPr>
-          <w:p>
-            <w:pPr>
-              <w:spacing w:line="276" w:lineRule="auto"/>
-            </w:pPr>
-            <w:r>
-              <w:rPr>
-                <w:rFonts w:ascii="Times New Roman" w:cs="Times New Roman" w:eastAsia="SimSun" w:hAnsi="Times New Roman"/>
-                <w:b w:val="false"/>
-                <w:bCs w:val="false"/>
-                <w:sz w:val="20"/>
-                <w:szCs w:val="20"/>
-              </w:rPr>
-              <w:t xml:space="preserve">Flash tier, recorded at run time</w:t>
-            </w:r>
-          </w:p>
-        </w:tc>
-        <w:tc>
-          <w:tcPr>
-            <w:tcW w:type="dxa" w:w="1880"/>
-            <w:tcBorders>
-              <w:top w:val="none" w:color="FFFFFF" w:sz="0"/>
-              <w:left w:val="none" w:color="FFFFFF" w:sz="0"/>
-              <w:bottom w:val="none" w:color="FFFFFF" w:sz="0"/>
-              <w:right w:val="none" w:color="FFFFFF" w:sz="0"/>
-            </w:tcBorders>
-            <w:tcMar>
-              <w:top w:type="dxa" w:w="40"/>
-              <w:left w:type="dxa" w:w="80"/>
-              <w:bottom w:type="dxa" w:w="40"/>
-              <w:right w:type="dxa" w:w="80"/>
-            </w:tcMar>
-          </w:tcPr>
-          <w:p>
-            <w:pPr>
-              <w:spacing w:line="276" w:lineRule="auto"/>
-            </w:pPr>
-            <w:r>
-              <w:rPr>
-                <w:rFonts w:ascii="Times New Roman" w:cs="Times New Roman" w:eastAsia="SimSun" w:hAnsi="Times New Roman"/>
-                <w:b w:val="false"/>
-                <w:bCs w:val="false"/>
-                <w:sz w:val="20"/>
-                <w:szCs w:val="20"/>
-              </w:rPr>
-              <w:t xml:space="preserve">Recorded at run time</w:t>
+            <w:tcW w:type="dxa" w:w="2912"/>
+            <w:tcBorders>
+              <w:top w:val="none" w:color="FFFFFF" w:sz="0"/>
+              <w:left w:val="none" w:color="FFFFFF" w:sz="0"/>
+              <w:bottom w:val="none" w:color="FFFFFF" w:sz="0"/>
+              <w:right w:val="none" w:color="FFFFFF" w:sz="0"/>
+            </w:tcBorders>
+            <w:tcMar>
+              <w:top w:type="dxa" w:w="40"/>
+              <w:left w:type="dxa" w:w="80"/>
+              <w:bottom w:type="dxa" w:w="40"/>
+              <w:right w:type="dxa" w:w="80"/>
+            </w:tcMar>
+          </w:tcPr>
+          <w:p>
+            <w:pPr>
+              <w:spacing w:line="276" w:lineRule="auto"/>
+            </w:pPr>
+            <w:r>
+              <w:rPr>
+                <w:rFonts w:ascii="Times New Roman" w:cs="Times New Roman" w:eastAsia="SimSun" w:hAnsi="Times New Roman"/>
+                <w:b w:val="false"/>
+                <w:bCs w:val="false"/>
+                <w:sz w:val="20"/>
+                <w:szCs w:val="20"/>
+              </w:rPr>
+              <w:t xml:space="preserve">bytedance-seed/seed-2.0-mini</w:t>
+            </w:r>
+          </w:p>
+        </w:tc>
+        <w:tc>
+          <w:tcPr>
+            <w:tcW w:type="dxa" w:w="2718"/>
+            <w:tcBorders>
+              <w:top w:val="none" w:color="FFFFFF" w:sz="0"/>
+              <w:left w:val="none" w:color="FFFFFF" w:sz="0"/>
+              <w:bottom w:val="none" w:color="FFFFFF" w:sz="0"/>
+              <w:right w:val="none" w:color="FFFFFF" w:sz="0"/>
+            </w:tcBorders>
+            <w:tcMar>
+              <w:top w:type="dxa" w:w="40"/>
+              <w:left w:type="dxa" w:w="80"/>
+              <w:bottom w:type="dxa" w:w="40"/>
+              <w:right w:type="dxa" w:w="80"/>
+            </w:tcMar>
+          </w:tcPr>
+          <w:p>
+            <w:pPr>
+              <w:spacing w:line="276" w:lineRule="auto"/>
+            </w:pPr>
+            <w:r>
+              <w:rPr>
+                <w:rFonts w:ascii="Times New Roman" w:cs="Times New Roman" w:eastAsia="SimSun" w:hAnsi="Times New Roman"/>
+                <w:b w:val="false"/>
+                <w:bCs w:val="false"/>
+                <w:sz w:val="20"/>
+                <w:szCs w:val="20"/>
+              </w:rPr>
+              <w:t xml:space="preserve">deepseek/deepseek-v4-flash</w:t>
+            </w:r>
+          </w:p>
+        </w:tc>
+        <w:tc>
+          <w:tcPr>
+            <w:tcW w:type="dxa" w:w="2134"/>
+            <w:tcBorders>
+              <w:top w:val="none" w:color="FFFFFF" w:sz="0"/>
+              <w:left w:val="none" w:color="FFFFFF" w:sz="0"/>
+              <w:bottom w:val="none" w:color="FFFFFF" w:sz="0"/>
+              <w:right w:val="none" w:color="FFFFFF" w:sz="0"/>
+            </w:tcBorders>
+            <w:tcMar>
+              <w:top w:type="dxa" w:w="40"/>
+              <w:left w:type="dxa" w:w="80"/>
+              <w:bottom w:type="dxa" w:w="40"/>
+              <w:right w:type="dxa" w:w="80"/>
+            </w:tcMar>
+          </w:tcPr>
+          <w:p>
+            <w:pPr>
+              <w:spacing w:line="276" w:lineRule="auto"/>
+            </w:pPr>
+            <w:r>
+              <w:rPr>
+                <w:rFonts w:ascii="Times New Roman" w:cs="Times New Roman" w:eastAsia="SimSun" w:hAnsi="Times New Roman"/>
+                <w:b w:val="false"/>
+                <w:bCs w:val="false"/>
+                <w:sz w:val="20"/>
+                <w:szCs w:val="20"/>
+              </w:rPr>
+              <w:t xml:space="preserve">moonshotai/kimi-k2.6</w:t>
             </w:r>
           </w:p>
         </w:tc>
@@ -6768,129 +6768,129 @@
         </w:trPr>
         <w:tc>
           <w:tcPr>
-            <w:tcW w:type="dxa" w:w="1886"/>
-            <w:tcBorders>
-              <w:top w:val="none" w:color="FFFFFF" w:sz="0"/>
-              <w:left w:val="none" w:color="FFFFFF" w:sz="0"/>
-              <w:bottom w:val="none" w:color="FFFFFF" w:sz="0"/>
-              <w:right w:val="none" w:color="FFFFFF" w:sz="0"/>
-            </w:tcBorders>
-            <w:tcMar>
-              <w:top w:type="dxa" w:w="40"/>
-              <w:left w:type="dxa" w:w="80"/>
-              <w:bottom w:type="dxa" w:w="40"/>
-              <w:right w:type="dxa" w:w="80"/>
-            </w:tcMar>
-          </w:tcPr>
-          <w:p>
-            <w:pPr>
-              <w:spacing w:line="276" w:lineRule="auto"/>
-            </w:pPr>
-            <w:r>
-              <w:rPr>
-                <w:rFonts w:ascii="Times New Roman" w:cs="Times New Roman" w:eastAsia="SimSun" w:hAnsi="Times New Roman"/>
-                <w:b w:val="false"/>
-                <w:bCs w:val="false"/>
-                <w:sz w:val="20"/>
-                <w:szCs w:val="20"/>
-              </w:rPr>
-              <w:t xml:space="preserve">Temperature</w:t>
-            </w:r>
-          </w:p>
-        </w:tc>
-        <w:tc>
-          <w:tcPr>
-            <w:tcW w:type="dxa" w:w="3567"/>
-            <w:tcBorders>
-              <w:top w:val="none" w:color="FFFFFF" w:sz="0"/>
-              <w:left w:val="none" w:color="FFFFFF" w:sz="0"/>
-              <w:bottom w:val="none" w:color="FFFFFF" w:sz="0"/>
-              <w:right w:val="none" w:color="FFFFFF" w:sz="0"/>
-            </w:tcBorders>
-            <w:tcMar>
-              <w:top w:type="dxa" w:w="40"/>
-              <w:left w:type="dxa" w:w="80"/>
-              <w:bottom w:type="dxa" w:w="40"/>
-              <w:right w:type="dxa" w:w="80"/>
-            </w:tcMar>
-          </w:tcPr>
-          <w:p>
-            <w:pPr>
-              <w:spacing w:line="276" w:lineRule="auto"/>
-            </w:pPr>
-            <w:r>
-              <w:rPr>
-                <w:rFonts w:ascii="Times New Roman" w:cs="Times New Roman" w:eastAsia="SimSun" w:hAnsi="Times New Roman"/>
-                <w:b w:val="false"/>
-                <w:bCs w:val="false"/>
-                <w:sz w:val="20"/>
-                <w:szCs w:val="20"/>
-              </w:rPr>
-              <w:t xml:space="preserve">0.7</w:t>
-            </w:r>
-          </w:p>
-        </w:tc>
-        <w:tc>
-          <w:tcPr>
-            <w:tcW w:type="dxa" w:w="1693"/>
-            <w:tcBorders>
-              <w:top w:val="none" w:color="FFFFFF" w:sz="0"/>
-              <w:left w:val="none" w:color="FFFFFF" w:sz="0"/>
-              <w:bottom w:val="none" w:color="FFFFFF" w:sz="0"/>
-              <w:right w:val="none" w:color="FFFFFF" w:sz="0"/>
-            </w:tcBorders>
-            <w:tcMar>
-              <w:top w:type="dxa" w:w="40"/>
-              <w:left w:type="dxa" w:w="80"/>
-              <w:bottom w:type="dxa" w:w="40"/>
-              <w:right w:type="dxa" w:w="80"/>
-            </w:tcMar>
-          </w:tcPr>
-          <w:p>
-            <w:pPr>
-              <w:spacing w:line="276" w:lineRule="auto"/>
-            </w:pPr>
-            <w:r>
-              <w:rPr>
-                <w:rFonts w:ascii="Times New Roman" w:cs="Times New Roman" w:eastAsia="SimSun" w:hAnsi="Times New Roman"/>
-                <w:b w:val="false"/>
-                <w:bCs w:val="false"/>
-                <w:sz w:val="20"/>
-                <w:szCs w:val="20"/>
-              </w:rPr>
-              <w:t xml:space="preserve">0.7</w:t>
-            </w:r>
-          </w:p>
-        </w:tc>
-        <w:tc>
-          <w:tcPr>
-            <w:tcW w:type="dxa" w:w="1880"/>
-            <w:tcBorders>
-              <w:top w:val="none" w:color="FFFFFF" w:sz="0"/>
-              <w:left w:val="none" w:color="FFFFFF" w:sz="0"/>
-              <w:bottom w:val="none" w:color="FFFFFF" w:sz="0"/>
-              <w:right w:val="none" w:color="FFFFFF" w:sz="0"/>
-            </w:tcBorders>
-            <w:tcMar>
-              <w:top w:type="dxa" w:w="40"/>
-              <w:left w:type="dxa" w:w="80"/>
-              <w:bottom w:type="dxa" w:w="40"/>
-              <w:right w:type="dxa" w:w="80"/>
-            </w:tcMar>
-          </w:tcPr>
-          <w:p>
-            <w:pPr>
-              <w:spacing w:line="276" w:lineRule="auto"/>
-            </w:pPr>
-            <w:r>
-              <w:rPr>
-                <w:rFonts w:ascii="Times New Roman" w:cs="Times New Roman" w:eastAsia="SimSun" w:hAnsi="Times New Roman"/>
-                <w:b w:val="false"/>
-                <w:bCs w:val="false"/>
-                <w:sz w:val="20"/>
-                <w:szCs w:val="20"/>
-              </w:rPr>
-              <w:t xml:space="preserve">0.7</w:t>
+            <w:tcW w:type="dxa" w:w="1262"/>
+            <w:tcBorders>
+              <w:top w:val="none" w:color="FFFFFF" w:sz="0"/>
+              <w:left w:val="none" w:color="FFFFFF" w:sz="0"/>
+              <w:bottom w:val="none" w:color="FFFFFF" w:sz="0"/>
+              <w:right w:val="none" w:color="FFFFFF" w:sz="0"/>
+            </w:tcBorders>
+            <w:tcMar>
+              <w:top w:type="dxa" w:w="40"/>
+              <w:left w:type="dxa" w:w="80"/>
+              <w:bottom w:type="dxa" w:w="40"/>
+              <w:right w:type="dxa" w:w="80"/>
+            </w:tcMar>
+          </w:tcPr>
+          <w:p>
+            <w:pPr>
+              <w:spacing w:line="276" w:lineRule="auto"/>
+            </w:pPr>
+            <w:r>
+              <w:rPr>
+                <w:rFonts w:ascii="Times New Roman" w:cs="Times New Roman" w:eastAsia="SimSun" w:hAnsi="Times New Roman"/>
+                <w:b w:val="false"/>
+                <w:bCs w:val="false"/>
+                <w:sz w:val="20"/>
+                <w:szCs w:val="20"/>
+              </w:rPr>
+              <w:t xml:space="preserve">Serving provider (pinned)</w:t>
+            </w:r>
+          </w:p>
+        </w:tc>
+        <w:tc>
+          <w:tcPr>
+            <w:tcW w:type="dxa" w:w="2912"/>
+            <w:tcBorders>
+              <w:top w:val="none" w:color="FFFFFF" w:sz="0"/>
+              <w:left w:val="none" w:color="FFFFFF" w:sz="0"/>
+              <w:bottom w:val="none" w:color="FFFFFF" w:sz="0"/>
+              <w:right w:val="none" w:color="FFFFFF" w:sz="0"/>
+            </w:tcBorders>
+            <w:tcMar>
+              <w:top w:type="dxa" w:w="40"/>
+              <w:left w:type="dxa" w:w="80"/>
+              <w:bottom w:type="dxa" w:w="40"/>
+              <w:right w:type="dxa" w:w="80"/>
+            </w:tcMar>
+          </w:tcPr>
+          <w:p>
+            <w:pPr>
+              <w:spacing w:line="276" w:lineRule="auto"/>
+            </w:pPr>
+            <w:r>
+              <w:rPr>
+                <w:rFonts w:ascii="Times New Roman" w:cs="Times New Roman" w:eastAsia="SimSun" w:hAnsi="Times New Roman"/>
+                <w:b w:val="false"/>
+                <w:bCs w:val="false"/>
+                <w:sz w:val="20"/>
+                <w:szCs w:val="20"/>
+              </w:rPr>
+              <w:t xml:space="preserve">Seed (ByteDance)</w:t>
+            </w:r>
+          </w:p>
+        </w:tc>
+        <w:tc>
+          <w:tcPr>
+            <w:tcW w:type="dxa" w:w="2718"/>
+            <w:tcBorders>
+              <w:top w:val="none" w:color="FFFFFF" w:sz="0"/>
+              <w:left w:val="none" w:color="FFFFFF" w:sz="0"/>
+              <w:bottom w:val="none" w:color="FFFFFF" w:sz="0"/>
+              <w:right w:val="none" w:color="FFFFFF" w:sz="0"/>
+            </w:tcBorders>
+            <w:tcMar>
+              <w:top w:type="dxa" w:w="40"/>
+              <w:left w:type="dxa" w:w="80"/>
+              <w:bottom w:type="dxa" w:w="40"/>
+              <w:right w:type="dxa" w:w="80"/>
+            </w:tcMar>
+          </w:tcPr>
+          <w:p>
+            <w:pPr>
+              <w:spacing w:line="276" w:lineRule="auto"/>
+            </w:pPr>
+            <w:r>
+              <w:rPr>
+                <w:rFonts w:ascii="Times New Roman" w:cs="Times New Roman" w:eastAsia="SimSun" w:hAnsi="Times New Roman"/>
+                <w:b w:val="false"/>
+                <w:bCs w:val="false"/>
+                <w:sz w:val="20"/>
+                <w:szCs w:val="20"/>
+              </w:rPr>
+              <w:t xml:space="preserve">SiliconFlow</w:t>
+            </w:r>
+          </w:p>
+        </w:tc>
+        <w:tc>
+          <w:tcPr>
+            <w:tcW w:type="dxa" w:w="2134"/>
+            <w:tcBorders>
+              <w:top w:val="none" w:color="FFFFFF" w:sz="0"/>
+              <w:left w:val="none" w:color="FFFFFF" w:sz="0"/>
+              <w:bottom w:val="none" w:color="FFFFFF" w:sz="0"/>
+              <w:right w:val="none" w:color="FFFFFF" w:sz="0"/>
+            </w:tcBorders>
+            <w:tcMar>
+              <w:top w:type="dxa" w:w="40"/>
+              <w:left w:type="dxa" w:w="80"/>
+              <w:bottom w:type="dxa" w:w="40"/>
+              <w:right w:type="dxa" w:w="80"/>
+            </w:tcMar>
+          </w:tcPr>
+          <w:p>
+            <w:pPr>
+              <w:spacing w:line="276" w:lineRule="auto"/>
+            </w:pPr>
+            <w:r>
+              <w:rPr>
+                <w:rFonts w:ascii="Times New Roman" w:cs="Times New Roman" w:eastAsia="SimSun" w:hAnsi="Times New Roman"/>
+                <w:b w:val="false"/>
+                <w:bCs w:val="false"/>
+                <w:sz w:val="20"/>
+                <w:szCs w:val="20"/>
+              </w:rPr>
+              <w:t xml:space="preserve">Moonshot AI</w:t>
             </w:r>
           </w:p>
         </w:tc>
@@ -6901,129 +6901,129 @@
         </w:trPr>
         <w:tc>
           <w:tcPr>
-            <w:tcW w:type="dxa" w:w="1886"/>
-            <w:tcBorders>
-              <w:top w:val="none" w:color="FFFFFF" w:sz="0"/>
-              <w:left w:val="none" w:color="FFFFFF" w:sz="0"/>
-              <w:bottom w:val="none" w:color="FFFFFF" w:sz="0"/>
-              <w:right w:val="none" w:color="FFFFFF" w:sz="0"/>
-            </w:tcBorders>
-            <w:tcMar>
-              <w:top w:type="dxa" w:w="40"/>
-              <w:left w:type="dxa" w:w="80"/>
-              <w:bottom w:type="dxa" w:w="40"/>
-              <w:right w:type="dxa" w:w="80"/>
-            </w:tcMar>
-          </w:tcPr>
-          <w:p>
-            <w:pPr>
-              <w:spacing w:line="276" w:lineRule="auto"/>
-            </w:pPr>
-            <w:r>
-              <w:rPr>
-                <w:rFonts w:ascii="Times New Roman" w:cs="Times New Roman" w:eastAsia="SimSun" w:hAnsi="Times New Roman"/>
-                <w:b w:val="false"/>
-                <w:bCs w:val="false"/>
-                <w:sz w:val="20"/>
-                <w:szCs w:val="20"/>
-              </w:rPr>
-              <w:t xml:space="preserve">Reasoning</w:t>
-            </w:r>
-          </w:p>
-        </w:tc>
-        <w:tc>
-          <w:tcPr>
-            <w:tcW w:type="dxa" w:w="3567"/>
-            <w:tcBorders>
-              <w:top w:val="none" w:color="FFFFFF" w:sz="0"/>
-              <w:left w:val="none" w:color="FFFFFF" w:sz="0"/>
-              <w:bottom w:val="none" w:color="FFFFFF" w:sz="0"/>
-              <w:right w:val="none" w:color="FFFFFF" w:sz="0"/>
-            </w:tcBorders>
-            <w:tcMar>
-              <w:top w:type="dxa" w:w="40"/>
-              <w:left w:type="dxa" w:w="80"/>
-              <w:bottom w:type="dxa" w:w="40"/>
-              <w:right w:type="dxa" w:w="80"/>
-            </w:tcMar>
-          </w:tcPr>
-          <w:p>
-            <w:pPr>
-              <w:spacing w:line="276" w:lineRule="auto"/>
-            </w:pPr>
-            <w:r>
-              <w:rPr>
-                <w:rFonts w:ascii="Times New Roman" w:cs="Times New Roman" w:eastAsia="SimSun" w:hAnsi="Times New Roman"/>
-                <w:b w:val="false"/>
-                <w:bCs w:val="false"/>
-                <w:sz w:val="20"/>
-                <w:szCs w:val="20"/>
-              </w:rPr>
-              <w:t xml:space="preserve">Thinking disabled</w:t>
-            </w:r>
-          </w:p>
-        </w:tc>
-        <w:tc>
-          <w:tcPr>
-            <w:tcW w:type="dxa" w:w="1693"/>
-            <w:tcBorders>
-              <w:top w:val="none" w:color="FFFFFF" w:sz="0"/>
-              <w:left w:val="none" w:color="FFFFFF" w:sz="0"/>
-              <w:bottom w:val="none" w:color="FFFFFF" w:sz="0"/>
-              <w:right w:val="none" w:color="FFFFFF" w:sz="0"/>
-            </w:tcBorders>
-            <w:tcMar>
-              <w:top w:type="dxa" w:w="40"/>
-              <w:left w:type="dxa" w:w="80"/>
-              <w:bottom w:type="dxa" w:w="40"/>
-              <w:right w:type="dxa" w:w="80"/>
-            </w:tcMar>
-          </w:tcPr>
-          <w:p>
-            <w:pPr>
-              <w:spacing w:line="276" w:lineRule="auto"/>
-            </w:pPr>
-            <w:r>
-              <w:rPr>
-                <w:rFonts w:ascii="Times New Roman" w:cs="Times New Roman" w:eastAsia="SimSun" w:hAnsi="Times New Roman"/>
-                <w:b w:val="false"/>
-                <w:bCs w:val="false"/>
-                <w:sz w:val="20"/>
-                <w:szCs w:val="20"/>
-              </w:rPr>
-              <w:t xml:space="preserve">Thinking disabled</w:t>
-            </w:r>
-          </w:p>
-        </w:tc>
-        <w:tc>
-          <w:tcPr>
-            <w:tcW w:type="dxa" w:w="1880"/>
-            <w:tcBorders>
-              <w:top w:val="none" w:color="FFFFFF" w:sz="0"/>
-              <w:left w:val="none" w:color="FFFFFF" w:sz="0"/>
-              <w:bottom w:val="none" w:color="FFFFFF" w:sz="0"/>
-              <w:right w:val="none" w:color="FFFFFF" w:sz="0"/>
-            </w:tcBorders>
-            <w:tcMar>
-              <w:top w:type="dxa" w:w="40"/>
-              <w:left w:type="dxa" w:w="80"/>
-              <w:bottom w:type="dxa" w:w="40"/>
-              <w:right w:type="dxa" w:w="80"/>
-            </w:tcMar>
-          </w:tcPr>
-          <w:p>
-            <w:pPr>
-              <w:spacing w:line="276" w:lineRule="auto"/>
-            </w:pPr>
-            <w:r>
-              <w:rPr>
-                <w:rFonts w:ascii="Times New Roman" w:cs="Times New Roman" w:eastAsia="SimSun" w:hAnsi="Times New Roman"/>
-                <w:b w:val="false"/>
-                <w:bCs w:val="false"/>
-                <w:sz w:val="20"/>
-                <w:szCs w:val="20"/>
-              </w:rPr>
-              <w:t xml:space="preserve">Endpoint default, recorded</w:t>
+            <w:tcW w:type="dxa" w:w="1262"/>
+            <w:tcBorders>
+              <w:top w:val="none" w:color="FFFFFF" w:sz="0"/>
+              <w:left w:val="none" w:color="FFFFFF" w:sz="0"/>
+              <w:bottom w:val="none" w:color="FFFFFF" w:sz="0"/>
+              <w:right w:val="none" w:color="FFFFFF" w:sz="0"/>
+            </w:tcBorders>
+            <w:tcMar>
+              <w:top w:type="dxa" w:w="40"/>
+              <w:left w:type="dxa" w:w="80"/>
+              <w:bottom w:type="dxa" w:w="40"/>
+              <w:right w:type="dxa" w:w="80"/>
+            </w:tcMar>
+          </w:tcPr>
+          <w:p>
+            <w:pPr>
+              <w:spacing w:line="276" w:lineRule="auto"/>
+            </w:pPr>
+            <w:r>
+              <w:rPr>
+                <w:rFonts w:ascii="Times New Roman" w:cs="Times New Roman" w:eastAsia="SimSun" w:hAnsi="Times New Roman"/>
+                <w:b w:val="false"/>
+                <w:bCs w:val="false"/>
+                <w:sz w:val="20"/>
+                <w:szCs w:val="20"/>
+              </w:rPr>
+              <w:t xml:space="preserve">Temperature</w:t>
+            </w:r>
+          </w:p>
+        </w:tc>
+        <w:tc>
+          <w:tcPr>
+            <w:tcW w:type="dxa" w:w="2912"/>
+            <w:tcBorders>
+              <w:top w:val="none" w:color="FFFFFF" w:sz="0"/>
+              <w:left w:val="none" w:color="FFFFFF" w:sz="0"/>
+              <w:bottom w:val="none" w:color="FFFFFF" w:sz="0"/>
+              <w:right w:val="none" w:color="FFFFFF" w:sz="0"/>
+            </w:tcBorders>
+            <w:tcMar>
+              <w:top w:type="dxa" w:w="40"/>
+              <w:left w:type="dxa" w:w="80"/>
+              <w:bottom w:type="dxa" w:w="40"/>
+              <w:right w:type="dxa" w:w="80"/>
+            </w:tcMar>
+          </w:tcPr>
+          <w:p>
+            <w:pPr>
+              <w:spacing w:line="276" w:lineRule="auto"/>
+            </w:pPr>
+            <w:r>
+              <w:rPr>
+                <w:rFonts w:ascii="Times New Roman" w:cs="Times New Roman" w:eastAsia="SimSun" w:hAnsi="Times New Roman"/>
+                <w:b w:val="false"/>
+                <w:bCs w:val="false"/>
+                <w:sz w:val="20"/>
+                <w:szCs w:val="20"/>
+              </w:rPr>
+              <w:t xml:space="preserve">0.7</w:t>
+            </w:r>
+          </w:p>
+        </w:tc>
+        <w:tc>
+          <w:tcPr>
+            <w:tcW w:type="dxa" w:w="2718"/>
+            <w:tcBorders>
+              <w:top w:val="none" w:color="FFFFFF" w:sz="0"/>
+              <w:left w:val="none" w:color="FFFFFF" w:sz="0"/>
+              <w:bottom w:val="none" w:color="FFFFFF" w:sz="0"/>
+              <w:right w:val="none" w:color="FFFFFF" w:sz="0"/>
+            </w:tcBorders>
+            <w:tcMar>
+              <w:top w:type="dxa" w:w="40"/>
+              <w:left w:type="dxa" w:w="80"/>
+              <w:bottom w:type="dxa" w:w="40"/>
+              <w:right w:type="dxa" w:w="80"/>
+            </w:tcMar>
+          </w:tcPr>
+          <w:p>
+            <w:pPr>
+              <w:spacing w:line="276" w:lineRule="auto"/>
+            </w:pPr>
+            <w:r>
+              <w:rPr>
+                <w:rFonts w:ascii="Times New Roman" w:cs="Times New Roman" w:eastAsia="SimSun" w:hAnsi="Times New Roman"/>
+                <w:b w:val="false"/>
+                <w:bCs w:val="false"/>
+                <w:sz w:val="20"/>
+                <w:szCs w:val="20"/>
+              </w:rPr>
+              <w:t xml:space="preserve">0.7</w:t>
+            </w:r>
+          </w:p>
+        </w:tc>
+        <w:tc>
+          <w:tcPr>
+            <w:tcW w:type="dxa" w:w="2134"/>
+            <w:tcBorders>
+              <w:top w:val="none" w:color="FFFFFF" w:sz="0"/>
+              <w:left w:val="none" w:color="FFFFFF" w:sz="0"/>
+              <w:bottom w:val="none" w:color="FFFFFF" w:sz="0"/>
+              <w:right w:val="none" w:color="FFFFFF" w:sz="0"/>
+            </w:tcBorders>
+            <w:tcMar>
+              <w:top w:type="dxa" w:w="40"/>
+              <w:left w:type="dxa" w:w="80"/>
+              <w:bottom w:type="dxa" w:w="40"/>
+              <w:right w:type="dxa" w:w="80"/>
+            </w:tcMar>
+          </w:tcPr>
+          <w:p>
+            <w:pPr>
+              <w:spacing w:line="276" w:lineRule="auto"/>
+            </w:pPr>
+            <w:r>
+              <w:rPr>
+                <w:rFonts w:ascii="Times New Roman" w:cs="Times New Roman" w:eastAsia="SimSun" w:hAnsi="Times New Roman"/>
+                <w:b w:val="false"/>
+                <w:bCs w:val="false"/>
+                <w:sz w:val="20"/>
+                <w:szCs w:val="20"/>
+              </w:rPr>
+              <w:t xml:space="preserve">0.7</w:t>
             </w:r>
           </w:p>
         </w:tc>
@@ -7034,129 +7034,129 @@
         </w:trPr>
         <w:tc>
           <w:tcPr>
-            <w:tcW w:type="dxa" w:w="1886"/>
-            <w:tcBorders>
-              <w:top w:val="none" w:color="FFFFFF" w:sz="0"/>
-              <w:left w:val="none" w:color="FFFFFF" w:sz="0"/>
-              <w:bottom w:val="none" w:color="FFFFFF" w:sz="0"/>
-              <w:right w:val="none" w:color="FFFFFF" w:sz="0"/>
-            </w:tcBorders>
-            <w:tcMar>
-              <w:top w:type="dxa" w:w="40"/>
-              <w:left w:type="dxa" w:w="80"/>
-              <w:bottom w:type="dxa" w:w="40"/>
-              <w:right w:type="dxa" w:w="80"/>
-            </w:tcMar>
-          </w:tcPr>
-          <w:p>
-            <w:pPr>
-              <w:spacing w:line="276" w:lineRule="auto"/>
-            </w:pPr>
-            <w:r>
-              <w:rPr>
-                <w:rFonts w:ascii="Times New Roman" w:cs="Times New Roman" w:eastAsia="SimSun" w:hAnsi="Times New Roman"/>
-                <w:b w:val="false"/>
-                <w:bCs w:val="false"/>
-                <w:sz w:val="20"/>
-                <w:szCs w:val="20"/>
-              </w:rPr>
-              <w:t xml:space="preserve">Output</w:t>
-            </w:r>
-          </w:p>
-        </w:tc>
-        <w:tc>
-          <w:tcPr>
-            <w:tcW w:type="dxa" w:w="3567"/>
-            <w:tcBorders>
-              <w:top w:val="none" w:color="FFFFFF" w:sz="0"/>
-              <w:left w:val="none" w:color="FFFFFF" w:sz="0"/>
-              <w:bottom w:val="none" w:color="FFFFFF" w:sz="0"/>
-              <w:right w:val="none" w:color="FFFFFF" w:sz="0"/>
-            </w:tcBorders>
-            <w:tcMar>
-              <w:top w:type="dxa" w:w="40"/>
-              <w:left w:type="dxa" w:w="80"/>
-              <w:bottom w:type="dxa" w:w="40"/>
-              <w:right w:type="dxa" w:w="80"/>
-            </w:tcMar>
-          </w:tcPr>
-          <w:p>
-            <w:pPr>
-              <w:spacing w:line="276" w:lineRule="auto"/>
-            </w:pPr>
-            <w:r>
-              <w:rPr>
-                <w:rFonts w:ascii="Times New Roman" w:cs="Times New Roman" w:eastAsia="SimSun" w:hAnsi="Times New Roman"/>
-                <w:b w:val="false"/>
-                <w:bCs w:val="false"/>
-                <w:sz w:val="20"/>
-                <w:szCs w:val="20"/>
-              </w:rPr>
-              <w:t xml:space="preserve">JSON mode, up to 2,500 tokens</w:t>
-            </w:r>
-          </w:p>
-        </w:tc>
-        <w:tc>
-          <w:tcPr>
-            <w:tcW w:type="dxa" w:w="1693"/>
-            <w:tcBorders>
-              <w:top w:val="none" w:color="FFFFFF" w:sz="0"/>
-              <w:left w:val="none" w:color="FFFFFF" w:sz="0"/>
-              <w:bottom w:val="none" w:color="FFFFFF" w:sz="0"/>
-              <w:right w:val="none" w:color="FFFFFF" w:sz="0"/>
-            </w:tcBorders>
-            <w:tcMar>
-              <w:top w:type="dxa" w:w="40"/>
-              <w:left w:type="dxa" w:w="80"/>
-              <w:bottom w:type="dxa" w:w="40"/>
-              <w:right w:type="dxa" w:w="80"/>
-            </w:tcMar>
-          </w:tcPr>
-          <w:p>
-            <w:pPr>
-              <w:spacing w:line="276" w:lineRule="auto"/>
-            </w:pPr>
-            <w:r>
-              <w:rPr>
-                <w:rFonts w:ascii="Times New Roman" w:cs="Times New Roman" w:eastAsia="SimSun" w:hAnsi="Times New Roman"/>
-                <w:b w:val="false"/>
-                <w:bCs w:val="false"/>
-                <w:sz w:val="20"/>
-                <w:szCs w:val="20"/>
-              </w:rPr>
-              <w:t xml:space="preserve">Same</w:t>
-            </w:r>
-          </w:p>
-        </w:tc>
-        <w:tc>
-          <w:tcPr>
-            <w:tcW w:type="dxa" w:w="1880"/>
-            <w:tcBorders>
-              <w:top w:val="none" w:color="FFFFFF" w:sz="0"/>
-              <w:left w:val="none" w:color="FFFFFF" w:sz="0"/>
-              <w:bottom w:val="none" w:color="FFFFFF" w:sz="0"/>
-              <w:right w:val="none" w:color="FFFFFF" w:sz="0"/>
-            </w:tcBorders>
-            <w:tcMar>
-              <w:top w:type="dxa" w:w="40"/>
-              <w:left w:type="dxa" w:w="80"/>
-              <w:bottom w:type="dxa" w:w="40"/>
-              <w:right w:type="dxa" w:w="80"/>
-            </w:tcMar>
-          </w:tcPr>
-          <w:p>
-            <w:pPr>
-              <w:spacing w:line="276" w:lineRule="auto"/>
-            </w:pPr>
-            <w:r>
-              <w:rPr>
-                <w:rFonts w:ascii="Times New Roman" w:cs="Times New Roman" w:eastAsia="SimSun" w:hAnsi="Times New Roman"/>
-                <w:b w:val="false"/>
-                <w:bCs w:val="false"/>
-                <w:sz w:val="20"/>
-                <w:szCs w:val="20"/>
-              </w:rPr>
-              <w:t xml:space="preserve">Same</w:t>
+            <w:tcW w:type="dxa" w:w="1262"/>
+            <w:tcBorders>
+              <w:top w:val="none" w:color="FFFFFF" w:sz="0"/>
+              <w:left w:val="none" w:color="FFFFFF" w:sz="0"/>
+              <w:bottom w:val="none" w:color="FFFFFF" w:sz="0"/>
+              <w:right w:val="none" w:color="FFFFFF" w:sz="0"/>
+            </w:tcBorders>
+            <w:tcMar>
+              <w:top w:type="dxa" w:w="40"/>
+              <w:left w:type="dxa" w:w="80"/>
+              <w:bottom w:type="dxa" w:w="40"/>
+              <w:right w:type="dxa" w:w="80"/>
+            </w:tcMar>
+          </w:tcPr>
+          <w:p>
+            <w:pPr>
+              <w:spacing w:line="276" w:lineRule="auto"/>
+            </w:pPr>
+            <w:r>
+              <w:rPr>
+                <w:rFonts w:ascii="Times New Roman" w:cs="Times New Roman" w:eastAsia="SimSun" w:hAnsi="Times New Roman"/>
+                <w:b w:val="false"/>
+                <w:bCs w:val="false"/>
+                <w:sz w:val="20"/>
+                <w:szCs w:val="20"/>
+              </w:rPr>
+              <w:t xml:space="preserve">Reasoning</w:t>
+            </w:r>
+          </w:p>
+        </w:tc>
+        <w:tc>
+          <w:tcPr>
+            <w:tcW w:type="dxa" w:w="2912"/>
+            <w:tcBorders>
+              <w:top w:val="none" w:color="FFFFFF" w:sz="0"/>
+              <w:left w:val="none" w:color="FFFFFF" w:sz="0"/>
+              <w:bottom w:val="none" w:color="FFFFFF" w:sz="0"/>
+              <w:right w:val="none" w:color="FFFFFF" w:sz="0"/>
+            </w:tcBorders>
+            <w:tcMar>
+              <w:top w:type="dxa" w:w="40"/>
+              <w:left w:type="dxa" w:w="80"/>
+              <w:bottom w:type="dxa" w:w="40"/>
+              <w:right w:type="dxa" w:w="80"/>
+            </w:tcMar>
+          </w:tcPr>
+          <w:p>
+            <w:pPr>
+              <w:spacing w:line="276" w:lineRule="auto"/>
+            </w:pPr>
+            <w:r>
+              <w:rPr>
+                <w:rFonts w:ascii="Times New Roman" w:cs="Times New Roman" w:eastAsia="SimSun" w:hAnsi="Times New Roman"/>
+                <w:b w:val="false"/>
+                <w:bCs w:val="false"/>
+                <w:sz w:val="20"/>
+                <w:szCs w:val="20"/>
+              </w:rPr>
+              <w:t xml:space="preserve">Disabled</w:t>
+            </w:r>
+          </w:p>
+        </w:tc>
+        <w:tc>
+          <w:tcPr>
+            <w:tcW w:type="dxa" w:w="2718"/>
+            <w:tcBorders>
+              <w:top w:val="none" w:color="FFFFFF" w:sz="0"/>
+              <w:left w:val="none" w:color="FFFFFF" w:sz="0"/>
+              <w:bottom w:val="none" w:color="FFFFFF" w:sz="0"/>
+              <w:right w:val="none" w:color="FFFFFF" w:sz="0"/>
+            </w:tcBorders>
+            <w:tcMar>
+              <w:top w:type="dxa" w:w="40"/>
+              <w:left w:type="dxa" w:w="80"/>
+              <w:bottom w:type="dxa" w:w="40"/>
+              <w:right w:type="dxa" w:w="80"/>
+            </w:tcMar>
+          </w:tcPr>
+          <w:p>
+            <w:pPr>
+              <w:spacing w:line="276" w:lineRule="auto"/>
+            </w:pPr>
+            <w:r>
+              <w:rPr>
+                <w:rFonts w:ascii="Times New Roman" w:cs="Times New Roman" w:eastAsia="SimSun" w:hAnsi="Times New Roman"/>
+                <w:b w:val="false"/>
+                <w:bCs w:val="false"/>
+                <w:sz w:val="20"/>
+                <w:szCs w:val="20"/>
+              </w:rPr>
+              <w:t xml:space="preserve">Disabled</w:t>
+            </w:r>
+          </w:p>
+        </w:tc>
+        <w:tc>
+          <w:tcPr>
+            <w:tcW w:type="dxa" w:w="2134"/>
+            <w:tcBorders>
+              <w:top w:val="none" w:color="FFFFFF" w:sz="0"/>
+              <w:left w:val="none" w:color="FFFFFF" w:sz="0"/>
+              <w:bottom w:val="none" w:color="FFFFFF" w:sz="0"/>
+              <w:right w:val="none" w:color="FFFFFF" w:sz="0"/>
+            </w:tcBorders>
+            <w:tcMar>
+              <w:top w:type="dxa" w:w="40"/>
+              <w:left w:type="dxa" w:w="80"/>
+              <w:bottom w:type="dxa" w:w="40"/>
+              <w:right w:type="dxa" w:w="80"/>
+            </w:tcMar>
+          </w:tcPr>
+          <w:p>
+            <w:pPr>
+              <w:spacing w:line="276" w:lineRule="auto"/>
+            </w:pPr>
+            <w:r>
+              <w:rPr>
+                <w:rFonts w:ascii="Times New Roman" w:cs="Times New Roman" w:eastAsia="SimSun" w:hAnsi="Times New Roman"/>
+                <w:b w:val="false"/>
+                <w:bCs w:val="false"/>
+                <w:sz w:val="20"/>
+                <w:szCs w:val="20"/>
+              </w:rPr>
+              <w:t xml:space="preserve">Disabled</w:t>
             </w:r>
           </w:p>
         </w:tc>
@@ -7167,7 +7167,140 @@
         </w:trPr>
         <w:tc>
           <w:tcPr>
-            <w:tcW w:type="dxa" w:w="1886"/>
+            <w:tcW w:type="dxa" w:w="1262"/>
+            <w:tcBorders>
+              <w:top w:val="none" w:color="FFFFFF" w:sz="0"/>
+              <w:left w:val="none" w:color="FFFFFF" w:sz="0"/>
+              <w:bottom w:val="none" w:color="FFFFFF" w:sz="0"/>
+              <w:right w:val="none" w:color="FFFFFF" w:sz="0"/>
+            </w:tcBorders>
+            <w:tcMar>
+              <w:top w:type="dxa" w:w="40"/>
+              <w:left w:type="dxa" w:w="80"/>
+              <w:bottom w:type="dxa" w:w="40"/>
+              <w:right w:type="dxa" w:w="80"/>
+            </w:tcMar>
+          </w:tcPr>
+          <w:p>
+            <w:pPr>
+              <w:spacing w:line="276" w:lineRule="auto"/>
+            </w:pPr>
+            <w:r>
+              <w:rPr>
+                <w:rFonts w:ascii="Times New Roman" w:cs="Times New Roman" w:eastAsia="SimSun" w:hAnsi="Times New Roman"/>
+                <w:b w:val="false"/>
+                <w:bCs w:val="false"/>
+                <w:sz w:val="20"/>
+                <w:szCs w:val="20"/>
+              </w:rPr>
+              <w:t xml:space="preserve">Output</w:t>
+            </w:r>
+          </w:p>
+        </w:tc>
+        <w:tc>
+          <w:tcPr>
+            <w:tcW w:type="dxa" w:w="2912"/>
+            <w:tcBorders>
+              <w:top w:val="none" w:color="FFFFFF" w:sz="0"/>
+              <w:left w:val="none" w:color="FFFFFF" w:sz="0"/>
+              <w:bottom w:val="none" w:color="FFFFFF" w:sz="0"/>
+              <w:right w:val="none" w:color="FFFFFF" w:sz="0"/>
+            </w:tcBorders>
+            <w:tcMar>
+              <w:top w:type="dxa" w:w="40"/>
+              <w:left w:type="dxa" w:w="80"/>
+              <w:bottom w:type="dxa" w:w="40"/>
+              <w:right w:type="dxa" w:w="80"/>
+            </w:tcMar>
+          </w:tcPr>
+          <w:p>
+            <w:pPr>
+              <w:spacing w:line="276" w:lineRule="auto"/>
+            </w:pPr>
+            <w:r>
+              <w:rPr>
+                <w:rFonts w:ascii="Times New Roman" w:cs="Times New Roman" w:eastAsia="SimSun" w:hAnsi="Times New Roman"/>
+                <w:b w:val="false"/>
+                <w:bCs w:val="false"/>
+                <w:sz w:val="20"/>
+                <w:szCs w:val="20"/>
+              </w:rPr>
+              <w:t xml:space="preserve">JSON mode, up to 2,500 tokens</w:t>
+            </w:r>
+          </w:p>
+        </w:tc>
+        <w:tc>
+          <w:tcPr>
+            <w:tcW w:type="dxa" w:w="2718"/>
+            <w:tcBorders>
+              <w:top w:val="none" w:color="FFFFFF" w:sz="0"/>
+              <w:left w:val="none" w:color="FFFFFF" w:sz="0"/>
+              <w:bottom w:val="none" w:color="FFFFFF" w:sz="0"/>
+              <w:right w:val="none" w:color="FFFFFF" w:sz="0"/>
+            </w:tcBorders>
+            <w:tcMar>
+              <w:top w:type="dxa" w:w="40"/>
+              <w:left w:type="dxa" w:w="80"/>
+              <w:bottom w:type="dxa" w:w="40"/>
+              <w:right w:type="dxa" w:w="80"/>
+            </w:tcMar>
+          </w:tcPr>
+          <w:p>
+            <w:pPr>
+              <w:spacing w:line="276" w:lineRule="auto"/>
+            </w:pPr>
+            <w:r>
+              <w:rPr>
+                <w:rFonts w:ascii="Times New Roman" w:cs="Times New Roman" w:eastAsia="SimSun" w:hAnsi="Times New Roman"/>
+                <w:b w:val="false"/>
+                <w:bCs w:val="false"/>
+                <w:sz w:val="20"/>
+                <w:szCs w:val="20"/>
+              </w:rPr>
+              <w:t xml:space="preserve">Same</w:t>
+            </w:r>
+          </w:p>
+        </w:tc>
+        <w:tc>
+          <w:tcPr>
+            <w:tcW w:type="dxa" w:w="2134"/>
+            <w:tcBorders>
+              <w:top w:val="none" w:color="FFFFFF" w:sz="0"/>
+              <w:left w:val="none" w:color="FFFFFF" w:sz="0"/>
+              <w:bottom w:val="none" w:color="FFFFFF" w:sz="0"/>
+              <w:right w:val="none" w:color="FFFFFF" w:sz="0"/>
+            </w:tcBorders>
+            <w:tcMar>
+              <w:top w:type="dxa" w:w="40"/>
+              <w:left w:type="dxa" w:w="80"/>
+              <w:bottom w:type="dxa" w:w="40"/>
+              <w:right w:type="dxa" w:w="80"/>
+            </w:tcMar>
+          </w:tcPr>
+          <w:p>
+            <w:pPr>
+              <w:spacing w:line="276" w:lineRule="auto"/>
+            </w:pPr>
+            <w:r>
+              <w:rPr>
+                <w:rFonts w:ascii="Times New Roman" w:cs="Times New Roman" w:eastAsia="SimSun" w:hAnsi="Times New Roman"/>
+                <w:b w:val="false"/>
+                <w:bCs w:val="false"/>
+                <w:sz w:val="20"/>
+                <w:szCs w:val="20"/>
+              </w:rPr>
+              <w:t xml:space="preserve">Same</w:t>
+            </w:r>
+          </w:p>
+        </w:tc>
+      </w:tr>
+      <w:tr>
+        <w:trPr>
+          <w:tblHeader w:val="false"/>
+        </w:trPr>
+        <w:tc>
+          <w:tcPr>
+            <w:tcW w:type="dxa" w:w="1262"/>
             <w:tcBorders>
               <w:top w:val="none" w:color="FFFFFF" w:sz="0"/>
               <w:left w:val="none" w:color="FFFFFF" w:sz="0"/>
@@ -7199,7 +7332,7 @@
         </w:tc>
         <w:tc>
           <w:tcPr>
-            <w:tcW w:type="dxa" w:w="3567"/>
+            <w:tcW w:type="dxa" w:w="2912"/>
             <w:tcBorders>
               <w:top w:val="none" w:color="FFFFFF" w:sz="0"/>
               <w:left w:val="none" w:color="FFFFFF" w:sz="0"/>
@@ -7231,7 +7364,7 @@
         </w:tc>
         <w:tc>
           <w:tcPr>
-            <w:tcW w:type="dxa" w:w="1693"/>
+            <w:tcW w:type="dxa" w:w="2718"/>
             <w:tcBorders>
               <w:top w:val="none" w:color="FFFFFF" w:sz="0"/>
               <w:left w:val="none" w:color="FFFFFF" w:sz="0"/>
@@ -7263,7 +7396,7 @@
         </w:tc>
         <w:tc>
           <w:tcPr>
-            <w:tcW w:type="dxa" w:w="1880"/>
+            <w:tcW w:type="dxa" w:w="2134"/>
             <w:tcBorders>
               <w:top w:val="none" w:color="FFFFFF" w:sz="0"/>
               <w:left w:val="none" w:color="FFFFFF" w:sz="0"/>
@@ -7316,7 +7449,7 @@
           <w:sz w:val="20"/>
           <w:szCs w:val="20"/>
         </w:rPr>
-        <w:t xml:space="preserve">Access through the Volcano Engine Ark Agent Plan endpoint (https://ark.cn-beijing.volces.com/api/plan/v3). Settings are in config/experiment_config.json; any parameter a model rejects is dropped and the change is recorded per call.</w:t>
+        <w:t xml:space="preserve">Access through OpenRouter (https://openrouter.ai/api/v1) on 23 October 2026, after the Volcano Engine Ark Agent Plan route failed (docs/run_status.md). Settings are in config/experiment_config.json; the serving provider is recorded for every call.</w:t>
       </w:r>
     </w:p>
     <w:p>
@@ -14613,7 +14746,7 @@
           <w:sz w:val="20"/>
           <w:szCs w:val="20"/>
         </w:rPr>
-        <w:t xml:space="preserve">FUND MENU (data as of 2026-10-23; source: Product risk ratings (RISKLEVEL) and reported stock allocation: Eastmoney / Tiantian Fund API (fundmobapi.eastmoney.com, pingzhongdata), because the Tonghuashun financial data API via fuyao.aicubes.cn has no product risk-rating field; NAV history for the backtest: Tonghuashun financial data API via fuyao.aicubes.cn)</w:t>
+        <w:t xml:space="preserve">FUND MENU (data as of 2026-10-23; source: Eastmoney / Tiantian Fund (product risk ratings and reported asset allocation))</w:t>
       </w:r>
     </w:p>
     <w:p>
@@ -21628,11 +21761,8 @@
     </w:p>
     <w:p>
       <w:pPr>
-        <w:pBdr>
-          <w:left w:val="single" w:color="9E9E9E" w:sz="6" w:space="6"/>
-        </w:pBdr>
-        <w:shd w:fill="EDEDED" w:color="auto" w:val="clear"/>
-        <w:spacing w:after="200" w:before="120" w:line="276" w:lineRule="auto"/>
+        <w:keepNext/>
+        <w:spacing w:after="0" w:before="200" w:line="276" w:lineRule="auto"/>
         <w:jc w:val="left"/>
       </w:pPr>
       <w:r>
@@ -21641,15 +21771,697 @@
           <w:b/>
           <w:bCs/>
         </w:rPr>
-        <w:t xml:space="preserve">Pending. </w:t>
-      </w:r>
+        <w:t xml:space="preserve">Table F1</w:t>
+      </w:r>
+    </w:p>
+    <w:p>
+      <w:pPr>
+        <w:keepNext/>
+        <w:spacing w:after="80" w:before="0" w:line="276" w:lineRule="auto"/>
+        <w:jc w:val="left"/>
+      </w:pPr>
       <w:r>
         <w:rPr>
           <w:rFonts w:ascii="Times New Roman" w:cs="Times New Roman" w:eastAsia="SimSun" w:hAnsi="Times New Roman"/>
           <w:i/>
           <w:iCs/>
         </w:rPr>
-        <w:t xml:space="preserve">The experiment has not yet been run; this appendix is filled from outputs/logs.</w:t>
+        <w:t xml:space="preserve">Experiment runs</w:t>
+      </w:r>
+    </w:p>
+    <w:tbl>
+      <w:tblPr>
+        <w:tblW w:type="dxa" w:w="9026"/>
+        <w:tblBorders>
+          <w:top w:val="single" w:color="auto" w:sz="4"/>
+          <w:left w:val="single" w:color="auto" w:sz="4"/>
+          <w:bottom w:val="single" w:color="auto" w:sz="4"/>
+          <w:right w:val="single" w:color="auto" w:sz="4"/>
+          <w:insideH w:val="single" w:color="auto" w:sz="4"/>
+          <w:insideV w:val="single" w:color="auto" w:sz="4"/>
+        </w:tblBorders>
+        <w:tblLayout w:type="fixed"/>
+      </w:tblPr>
+      <w:tblGrid>
+        <w:gridCol w:w="2182"/>
+        <w:gridCol w:w="2678"/>
+        <w:gridCol w:w="2678"/>
+        <w:gridCol w:w="694"/>
+        <w:gridCol w:w="794"/>
+      </w:tblGrid>
+      <w:tr>
+        <w:trPr>
+          <w:tblHeader/>
+        </w:trPr>
+        <w:tc>
+          <w:tcPr>
+            <w:tcW w:type="dxa" w:w="2182"/>
+            <w:tcBorders>
+              <w:top w:val="single" w:color="000000" w:sz="6"/>
+              <w:left w:val="none" w:color="FFFFFF" w:sz="0"/>
+              <w:bottom w:val="single" w:color="000000" w:sz="6"/>
+              <w:right w:val="none" w:color="FFFFFF" w:sz="0"/>
+            </w:tcBorders>
+            <w:tcMar>
+              <w:top w:type="dxa" w:w="40"/>
+              <w:left w:type="dxa" w:w="80"/>
+              <w:bottom w:type="dxa" w:w="40"/>
+              <w:right w:type="dxa" w:w="80"/>
+            </w:tcMar>
+          </w:tcPr>
+          <w:p>
+            <w:pPr>
+              <w:spacing w:line="276" w:lineRule="auto"/>
+            </w:pPr>
+            <w:r>
+              <w:rPr>
+                <w:rFonts w:ascii="Times New Roman" w:cs="Times New Roman" w:eastAsia="SimSun" w:hAnsi="Times New Roman"/>
+                <w:b/>
+                <w:bCs/>
+                <w:sz w:val="20"/>
+                <w:szCs w:val="20"/>
+              </w:rPr>
+              <w:t xml:space="preserve">Run</w:t>
+            </w:r>
+          </w:p>
+        </w:tc>
+        <w:tc>
+          <w:tcPr>
+            <w:tcW w:type="dxa" w:w="2678"/>
+            <w:tcBorders>
+              <w:top w:val="single" w:color="000000" w:sz="6"/>
+              <w:left w:val="none" w:color="FFFFFF" w:sz="0"/>
+              <w:bottom w:val="single" w:color="000000" w:sz="6"/>
+              <w:right w:val="none" w:color="FFFFFF" w:sz="0"/>
+            </w:tcBorders>
+            <w:tcMar>
+              <w:top w:type="dxa" w:w="40"/>
+              <w:left w:type="dxa" w:w="80"/>
+              <w:bottom w:type="dxa" w:w="40"/>
+              <w:right w:type="dxa" w:w="80"/>
+            </w:tcMar>
+          </w:tcPr>
+          <w:p>
+            <w:pPr>
+              <w:spacing w:line="276" w:lineRule="auto"/>
+            </w:pPr>
+            <w:r>
+              <w:rPr>
+                <w:rFonts w:ascii="Times New Roman" w:cs="Times New Roman" w:eastAsia="SimSun" w:hAnsi="Times New Roman"/>
+                <w:b/>
+                <w:bCs/>
+                <w:sz w:val="20"/>
+                <w:szCs w:val="20"/>
+              </w:rPr>
+              <w:t xml:space="preserve">Started</w:t>
+            </w:r>
+          </w:p>
+        </w:tc>
+        <w:tc>
+          <w:tcPr>
+            <w:tcW w:type="dxa" w:w="2678"/>
+            <w:tcBorders>
+              <w:top w:val="single" w:color="000000" w:sz="6"/>
+              <w:left w:val="none" w:color="FFFFFF" w:sz="0"/>
+              <w:bottom w:val="single" w:color="000000" w:sz="6"/>
+              <w:right w:val="none" w:color="FFFFFF" w:sz="0"/>
+            </w:tcBorders>
+            <w:tcMar>
+              <w:top w:type="dxa" w:w="40"/>
+              <w:left w:type="dxa" w:w="80"/>
+              <w:bottom w:type="dxa" w:w="40"/>
+              <w:right w:type="dxa" w:w="80"/>
+            </w:tcMar>
+          </w:tcPr>
+          <w:p>
+            <w:pPr>
+              <w:spacing w:line="276" w:lineRule="auto"/>
+            </w:pPr>
+            <w:r>
+              <w:rPr>
+                <w:rFonts w:ascii="Times New Roman" w:cs="Times New Roman" w:eastAsia="SimSun" w:hAnsi="Times New Roman"/>
+                <w:b/>
+                <w:bCs/>
+                <w:sz w:val="20"/>
+                <w:szCs w:val="20"/>
+              </w:rPr>
+              <w:t xml:space="preserve">Finished</w:t>
+            </w:r>
+          </w:p>
+        </w:tc>
+        <w:tc>
+          <w:tcPr>
+            <w:tcW w:type="dxa" w:w="694"/>
+            <w:tcBorders>
+              <w:top w:val="single" w:color="000000" w:sz="6"/>
+              <w:left w:val="none" w:color="FFFFFF" w:sz="0"/>
+              <w:bottom w:val="single" w:color="000000" w:sz="6"/>
+              <w:right w:val="none" w:color="FFFFFF" w:sz="0"/>
+            </w:tcBorders>
+            <w:tcMar>
+              <w:top w:type="dxa" w:w="40"/>
+              <w:left w:type="dxa" w:w="80"/>
+              <w:bottom w:type="dxa" w:w="40"/>
+              <w:right w:type="dxa" w:w="80"/>
+            </w:tcMar>
+          </w:tcPr>
+          <w:p>
+            <w:pPr>
+              <w:spacing w:line="276" w:lineRule="auto"/>
+            </w:pPr>
+            <w:r>
+              <w:rPr>
+                <w:rFonts w:ascii="Times New Roman" w:cs="Times New Roman" w:eastAsia="SimSun" w:hAnsi="Times New Roman"/>
+                <w:b/>
+                <w:bCs/>
+                <w:sz w:val="20"/>
+                <w:szCs w:val="20"/>
+              </w:rPr>
+              <w:t xml:space="preserve">Calls ok</w:t>
+            </w:r>
+          </w:p>
+        </w:tc>
+        <w:tc>
+          <w:tcPr>
+            <w:tcW w:type="dxa" w:w="794"/>
+            <w:tcBorders>
+              <w:top w:val="single" w:color="000000" w:sz="6"/>
+              <w:left w:val="none" w:color="FFFFFF" w:sz="0"/>
+              <w:bottom w:val="single" w:color="000000" w:sz="6"/>
+              <w:right w:val="none" w:color="FFFFFF" w:sz="0"/>
+            </w:tcBorders>
+            <w:tcMar>
+              <w:top w:type="dxa" w:w="40"/>
+              <w:left w:type="dxa" w:w="80"/>
+              <w:bottom w:type="dxa" w:w="40"/>
+              <w:right w:type="dxa" w:w="80"/>
+            </w:tcMar>
+          </w:tcPr>
+          <w:p>
+            <w:pPr>
+              <w:spacing w:line="276" w:lineRule="auto"/>
+            </w:pPr>
+            <w:r>
+              <w:rPr>
+                <w:rFonts w:ascii="Times New Roman" w:cs="Times New Roman" w:eastAsia="SimSun" w:hAnsi="Times New Roman"/>
+                <w:b/>
+                <w:bCs/>
+                <w:sz w:val="20"/>
+                <w:szCs w:val="20"/>
+              </w:rPr>
+              <w:t xml:space="preserve">Calls failed</w:t>
+            </w:r>
+          </w:p>
+        </w:tc>
+      </w:tr>
+      <w:tr>
+        <w:trPr>
+          <w:tblHeader w:val="false"/>
+        </w:trPr>
+        <w:tc>
+          <w:tcPr>
+            <w:tcW w:type="dxa" w:w="2182"/>
+            <w:tcBorders>
+              <w:top w:val="none" w:color="FFFFFF" w:sz="0"/>
+              <w:left w:val="none" w:color="FFFFFF" w:sz="0"/>
+              <w:bottom w:val="none" w:color="FFFFFF" w:sz="0"/>
+              <w:right w:val="none" w:color="FFFFFF" w:sz="0"/>
+            </w:tcBorders>
+            <w:tcMar>
+              <w:top w:type="dxa" w:w="40"/>
+              <w:left w:type="dxa" w:w="80"/>
+              <w:bottom w:type="dxa" w:w="40"/>
+              <w:right w:type="dxa" w:w="80"/>
+            </w:tcMar>
+          </w:tcPr>
+          <w:p>
+            <w:pPr>
+              <w:spacing w:line="276" w:lineRule="auto"/>
+            </w:pPr>
+            <w:r>
+              <w:rPr>
+                <w:rFonts w:ascii="Times New Roman" w:cs="Times New Roman" w:eastAsia="SimSun" w:hAnsi="Times New Roman"/>
+                <w:b w:val="false"/>
+                <w:bCs w:val="false"/>
+                <w:sz w:val="20"/>
+                <w:szCs w:val="20"/>
+              </w:rPr>
+              <w:t xml:space="preserve">run_20261023T082144Z</w:t>
+            </w:r>
+          </w:p>
+        </w:tc>
+        <w:tc>
+          <w:tcPr>
+            <w:tcW w:type="dxa" w:w="2678"/>
+            <w:tcBorders>
+              <w:top w:val="none" w:color="FFFFFF" w:sz="0"/>
+              <w:left w:val="none" w:color="FFFFFF" w:sz="0"/>
+              <w:bottom w:val="none" w:color="FFFFFF" w:sz="0"/>
+              <w:right w:val="none" w:color="FFFFFF" w:sz="0"/>
+            </w:tcBorders>
+            <w:tcMar>
+              <w:top w:type="dxa" w:w="40"/>
+              <w:left w:type="dxa" w:w="80"/>
+              <w:bottom w:type="dxa" w:w="40"/>
+              <w:right w:type="dxa" w:w="80"/>
+            </w:tcMar>
+          </w:tcPr>
+          <w:p>
+            <w:pPr>
+              <w:spacing w:line="276" w:lineRule="auto"/>
+            </w:pPr>
+            <w:r>
+              <w:rPr>
+                <w:rFonts w:ascii="Times New Roman" w:cs="Times New Roman" w:eastAsia="SimSun" w:hAnsi="Times New Roman"/>
+                <w:b w:val="false"/>
+                <w:bCs w:val="false"/>
+                <w:sz w:val="20"/>
+                <w:szCs w:val="20"/>
+              </w:rPr>
+              <w:t xml:space="preserve">2026-10-23T08:21:44+00:00</w:t>
+            </w:r>
+          </w:p>
+        </w:tc>
+        <w:tc>
+          <w:tcPr>
+            <w:tcW w:type="dxa" w:w="2678"/>
+            <w:tcBorders>
+              <w:top w:val="none" w:color="FFFFFF" w:sz="0"/>
+              <w:left w:val="none" w:color="FFFFFF" w:sz="0"/>
+              <w:bottom w:val="none" w:color="FFFFFF" w:sz="0"/>
+              <w:right w:val="none" w:color="FFFFFF" w:sz="0"/>
+            </w:tcBorders>
+            <w:tcMar>
+              <w:top w:type="dxa" w:w="40"/>
+              <w:left w:type="dxa" w:w="80"/>
+              <w:bottom w:type="dxa" w:w="40"/>
+              <w:right w:type="dxa" w:w="80"/>
+            </w:tcMar>
+          </w:tcPr>
+          <w:p>
+            <w:pPr>
+              <w:spacing w:line="276" w:lineRule="auto"/>
+            </w:pPr>
+            <w:r>
+              <w:rPr>
+                <w:rFonts w:ascii="Times New Roman" w:cs="Times New Roman" w:eastAsia="SimSun" w:hAnsi="Times New Roman"/>
+                <w:b w:val="false"/>
+                <w:bCs w:val="false"/>
+                <w:sz w:val="20"/>
+                <w:szCs w:val="20"/>
+              </w:rPr>
+              <w:t xml:space="preserve">2026-10-23T08:27:35+00:00</w:t>
+            </w:r>
+          </w:p>
+        </w:tc>
+        <w:tc>
+          <w:tcPr>
+            <w:tcW w:type="dxa" w:w="694"/>
+            <w:tcBorders>
+              <w:top w:val="none" w:color="FFFFFF" w:sz="0"/>
+              <w:left w:val="none" w:color="FFFFFF" w:sz="0"/>
+              <w:bottom w:val="none" w:color="FFFFFF" w:sz="0"/>
+              <w:right w:val="none" w:color="FFFFFF" w:sz="0"/>
+            </w:tcBorders>
+            <w:tcMar>
+              <w:top w:type="dxa" w:w="40"/>
+              <w:left w:type="dxa" w:w="80"/>
+              <w:bottom w:type="dxa" w:w="40"/>
+              <w:right w:type="dxa" w:w="80"/>
+            </w:tcMar>
+          </w:tcPr>
+          <w:p>
+            <w:pPr>
+              <w:spacing w:line="276" w:lineRule="auto"/>
+            </w:pPr>
+            <w:r>
+              <w:rPr>
+                <w:rFonts w:ascii="Times New Roman" w:cs="Times New Roman" w:eastAsia="SimSun" w:hAnsi="Times New Roman"/>
+                <w:b w:val="false"/>
+                <w:bCs w:val="false"/>
+                <w:sz w:val="20"/>
+                <w:szCs w:val="20"/>
+              </w:rPr>
+              <w:t xml:space="preserve">40.0</w:t>
+            </w:r>
+          </w:p>
+        </w:tc>
+        <w:tc>
+          <w:tcPr>
+            <w:tcW w:type="dxa" w:w="794"/>
+            <w:tcBorders>
+              <w:top w:val="none" w:color="FFFFFF" w:sz="0"/>
+              <w:left w:val="none" w:color="FFFFFF" w:sz="0"/>
+              <w:bottom w:val="none" w:color="FFFFFF" w:sz="0"/>
+              <w:right w:val="none" w:color="FFFFFF" w:sz="0"/>
+            </w:tcBorders>
+            <w:tcMar>
+              <w:top w:type="dxa" w:w="40"/>
+              <w:left w:type="dxa" w:w="80"/>
+              <w:bottom w:type="dxa" w:w="40"/>
+              <w:right w:type="dxa" w:w="80"/>
+            </w:tcMar>
+          </w:tcPr>
+          <w:p>
+            <w:pPr>
+              <w:spacing w:line="276" w:lineRule="auto"/>
+            </w:pPr>
+            <w:r>
+              <w:rPr>
+                <w:rFonts w:ascii="Times New Roman" w:cs="Times New Roman" w:eastAsia="SimSun" w:hAnsi="Times New Roman"/>
+                <w:b w:val="false"/>
+                <w:bCs w:val="false"/>
+                <w:sz w:val="20"/>
+                <w:szCs w:val="20"/>
+              </w:rPr>
+              <w:t xml:space="preserve">20.0</w:t>
+            </w:r>
+          </w:p>
+        </w:tc>
+      </w:tr>
+      <w:tr>
+        <w:trPr>
+          <w:tblHeader w:val="false"/>
+        </w:trPr>
+        <w:tc>
+          <w:tcPr>
+            <w:tcW w:type="dxa" w:w="2182"/>
+            <w:tcBorders>
+              <w:top w:val="none" w:color="FFFFFF" w:sz="0"/>
+              <w:left w:val="none" w:color="FFFFFF" w:sz="0"/>
+              <w:bottom w:val="none" w:color="FFFFFF" w:sz="0"/>
+              <w:right w:val="none" w:color="FFFFFF" w:sz="0"/>
+            </w:tcBorders>
+            <w:tcMar>
+              <w:top w:type="dxa" w:w="40"/>
+              <w:left w:type="dxa" w:w="80"/>
+              <w:bottom w:type="dxa" w:w="40"/>
+              <w:right w:type="dxa" w:w="80"/>
+            </w:tcMar>
+          </w:tcPr>
+          <w:p>
+            <w:pPr>
+              <w:spacing w:line="276" w:lineRule="auto"/>
+            </w:pPr>
+            <w:r>
+              <w:rPr>
+                <w:rFonts w:ascii="Times New Roman" w:cs="Times New Roman" w:eastAsia="SimSun" w:hAnsi="Times New Roman"/>
+                <w:b w:val="false"/>
+                <w:bCs w:val="false"/>
+                <w:sz w:val="20"/>
+                <w:szCs w:val="20"/>
+              </w:rPr>
+              <w:t xml:space="preserve">run_20261023T082807Z</w:t>
+            </w:r>
+          </w:p>
+        </w:tc>
+        <w:tc>
+          <w:tcPr>
+            <w:tcW w:type="dxa" w:w="2678"/>
+            <w:tcBorders>
+              <w:top w:val="none" w:color="FFFFFF" w:sz="0"/>
+              <w:left w:val="none" w:color="FFFFFF" w:sz="0"/>
+              <w:bottom w:val="none" w:color="FFFFFF" w:sz="0"/>
+              <w:right w:val="none" w:color="FFFFFF" w:sz="0"/>
+            </w:tcBorders>
+            <w:tcMar>
+              <w:top w:type="dxa" w:w="40"/>
+              <w:left w:type="dxa" w:w="80"/>
+              <w:bottom w:type="dxa" w:w="40"/>
+              <w:right w:type="dxa" w:w="80"/>
+            </w:tcMar>
+          </w:tcPr>
+          <w:p>
+            <w:pPr>
+              <w:spacing w:line="276" w:lineRule="auto"/>
+            </w:pPr>
+            <w:r>
+              <w:rPr>
+                <w:rFonts w:ascii="Times New Roman" w:cs="Times New Roman" w:eastAsia="SimSun" w:hAnsi="Times New Roman"/>
+                <w:b w:val="false"/>
+                <w:bCs w:val="false"/>
+                <w:sz w:val="20"/>
+                <w:szCs w:val="20"/>
+              </w:rPr>
+              <w:t xml:space="preserve">2026-10-23T08:28:07+00:00</w:t>
+            </w:r>
+          </w:p>
+        </w:tc>
+        <w:tc>
+          <w:tcPr>
+            <w:tcW w:type="dxa" w:w="2678"/>
+            <w:tcBorders>
+              <w:top w:val="none" w:color="FFFFFF" w:sz="0"/>
+              <w:left w:val="none" w:color="FFFFFF" w:sz="0"/>
+              <w:bottom w:val="none" w:color="FFFFFF" w:sz="0"/>
+              <w:right w:val="none" w:color="FFFFFF" w:sz="0"/>
+            </w:tcBorders>
+            <w:tcMar>
+              <w:top w:type="dxa" w:w="40"/>
+              <w:left w:type="dxa" w:w="80"/>
+              <w:bottom w:type="dxa" w:w="40"/>
+              <w:right w:type="dxa" w:w="80"/>
+            </w:tcMar>
+          </w:tcPr>
+          <w:p>
+            <w:pPr>
+              <w:spacing w:line="276" w:lineRule="auto"/>
+            </w:pPr>
+            <w:r>
+              <w:rPr>
+                <w:rFonts w:ascii="Times New Roman" w:cs="Times New Roman" w:eastAsia="SimSun" w:hAnsi="Times New Roman"/>
+                <w:b w:val="false"/>
+                <w:bCs w:val="false"/>
+                <w:sz w:val="20"/>
+                <w:szCs w:val="20"/>
+              </w:rPr>
+              <w:t xml:space="preserve">2026-10-23T08:29:34+00:00</w:t>
+            </w:r>
+          </w:p>
+        </w:tc>
+        <w:tc>
+          <w:tcPr>
+            <w:tcW w:type="dxa" w:w="694"/>
+            <w:tcBorders>
+              <w:top w:val="none" w:color="FFFFFF" w:sz="0"/>
+              <w:left w:val="none" w:color="FFFFFF" w:sz="0"/>
+              <w:bottom w:val="none" w:color="FFFFFF" w:sz="0"/>
+              <w:right w:val="none" w:color="FFFFFF" w:sz="0"/>
+            </w:tcBorders>
+            <w:tcMar>
+              <w:top w:type="dxa" w:w="40"/>
+              <w:left w:type="dxa" w:w="80"/>
+              <w:bottom w:type="dxa" w:w="40"/>
+              <w:right w:type="dxa" w:w="80"/>
+            </w:tcMar>
+          </w:tcPr>
+          <w:p>
+            <w:pPr>
+              <w:spacing w:line="276" w:lineRule="auto"/>
+            </w:pPr>
+            <w:r>
+              <w:rPr>
+                <w:rFonts w:ascii="Times New Roman" w:cs="Times New Roman" w:eastAsia="SimSun" w:hAnsi="Times New Roman"/>
+                <w:b w:val="false"/>
+                <w:bCs w:val="false"/>
+                <w:sz w:val="20"/>
+                <w:szCs w:val="20"/>
+              </w:rPr>
+              <w:t xml:space="preserve">20.0</w:t>
+            </w:r>
+          </w:p>
+        </w:tc>
+        <w:tc>
+          <w:tcPr>
+            <w:tcW w:type="dxa" w:w="794"/>
+            <w:tcBorders>
+              <w:top w:val="none" w:color="FFFFFF" w:sz="0"/>
+              <w:left w:val="none" w:color="FFFFFF" w:sz="0"/>
+              <w:bottom w:val="none" w:color="FFFFFF" w:sz="0"/>
+              <w:right w:val="none" w:color="FFFFFF" w:sz="0"/>
+            </w:tcBorders>
+            <w:tcMar>
+              <w:top w:type="dxa" w:w="40"/>
+              <w:left w:type="dxa" w:w="80"/>
+              <w:bottom w:type="dxa" w:w="40"/>
+              <w:right w:type="dxa" w:w="80"/>
+            </w:tcMar>
+          </w:tcPr>
+          <w:p>
+            <w:pPr>
+              <w:spacing w:line="276" w:lineRule="auto"/>
+            </w:pPr>
+            <w:r>
+              <w:rPr>
+                <w:rFonts w:ascii="Times New Roman" w:cs="Times New Roman" w:eastAsia="SimSun" w:hAnsi="Times New Roman"/>
+                <w:b w:val="false"/>
+                <w:bCs w:val="false"/>
+                <w:sz w:val="20"/>
+                <w:szCs w:val="20"/>
+              </w:rPr>
+              <w:t xml:space="preserve">0.0</w:t>
+            </w:r>
+          </w:p>
+        </w:tc>
+      </w:tr>
+      <w:tr>
+        <w:trPr>
+          <w:tblHeader w:val="false"/>
+        </w:trPr>
+        <w:tc>
+          <w:tcPr>
+            <w:tcW w:type="dxa" w:w="2182"/>
+            <w:tcBorders>
+              <w:top w:val="none" w:color="FFFFFF" w:sz="0"/>
+              <w:left w:val="none" w:color="FFFFFF" w:sz="0"/>
+              <w:bottom w:val="single" w:color="000000" w:sz="6"/>
+              <w:right w:val="none" w:color="FFFFFF" w:sz="0"/>
+            </w:tcBorders>
+            <w:tcMar>
+              <w:top w:type="dxa" w:w="40"/>
+              <w:left w:type="dxa" w:w="80"/>
+              <w:bottom w:type="dxa" w:w="40"/>
+              <w:right w:type="dxa" w:w="80"/>
+            </w:tcMar>
+          </w:tcPr>
+          <w:p>
+            <w:pPr>
+              <w:spacing w:line="276" w:lineRule="auto"/>
+            </w:pPr>
+            <w:r>
+              <w:rPr>
+                <w:rFonts w:ascii="Times New Roman" w:cs="Times New Roman" w:eastAsia="SimSun" w:hAnsi="Times New Roman"/>
+                <w:b w:val="false"/>
+                <w:bCs w:val="false"/>
+                <w:sz w:val="20"/>
+                <w:szCs w:val="20"/>
+              </w:rPr>
+              <w:t xml:space="preserve">run_20261023T083039Z</w:t>
+            </w:r>
+          </w:p>
+        </w:tc>
+        <w:tc>
+          <w:tcPr>
+            <w:tcW w:type="dxa" w:w="2678"/>
+            <w:tcBorders>
+              <w:top w:val="none" w:color="FFFFFF" w:sz="0"/>
+              <w:left w:val="none" w:color="FFFFFF" w:sz="0"/>
+              <w:bottom w:val="single" w:color="000000" w:sz="6"/>
+              <w:right w:val="none" w:color="FFFFFF" w:sz="0"/>
+            </w:tcBorders>
+            <w:tcMar>
+              <w:top w:type="dxa" w:w="40"/>
+              <w:left w:type="dxa" w:w="80"/>
+              <w:bottom w:type="dxa" w:w="40"/>
+              <w:right w:type="dxa" w:w="80"/>
+            </w:tcMar>
+          </w:tcPr>
+          <w:p>
+            <w:pPr>
+              <w:spacing w:line="276" w:lineRule="auto"/>
+            </w:pPr>
+            <w:r>
+              <w:rPr>
+                <w:rFonts w:ascii="Times New Roman" w:cs="Times New Roman" w:eastAsia="SimSun" w:hAnsi="Times New Roman"/>
+                <w:b w:val="false"/>
+                <w:bCs w:val="false"/>
+                <w:sz w:val="20"/>
+                <w:szCs w:val="20"/>
+              </w:rPr>
+              <w:t xml:space="preserve">2026-10-23T08:30:39+00:00</w:t>
+            </w:r>
+          </w:p>
+        </w:tc>
+        <w:tc>
+          <w:tcPr>
+            <w:tcW w:type="dxa" w:w="2678"/>
+            <w:tcBorders>
+              <w:top w:val="none" w:color="FFFFFF" w:sz="0"/>
+              <w:left w:val="none" w:color="FFFFFF" w:sz="0"/>
+              <w:bottom w:val="single" w:color="000000" w:sz="6"/>
+              <w:right w:val="none" w:color="FFFFFF" w:sz="0"/>
+            </w:tcBorders>
+            <w:tcMar>
+              <w:top w:type="dxa" w:w="40"/>
+              <w:left w:type="dxa" w:w="80"/>
+              <w:bottom w:type="dxa" w:w="40"/>
+              <w:right w:type="dxa" w:w="80"/>
+            </w:tcMar>
+          </w:tcPr>
+          <w:p>
+            <w:pPr>
+              <w:spacing w:line="276" w:lineRule="auto"/>
+            </w:pPr>
+          </w:p>
+        </w:tc>
+        <w:tc>
+          <w:tcPr>
+            <w:tcW w:type="dxa" w:w="694"/>
+            <w:tcBorders>
+              <w:top w:val="none" w:color="FFFFFF" w:sz="0"/>
+              <w:left w:val="none" w:color="FFFFFF" w:sz="0"/>
+              <w:bottom w:val="single" w:color="000000" w:sz="6"/>
+              <w:right w:val="none" w:color="FFFFFF" w:sz="0"/>
+            </w:tcBorders>
+            <w:tcMar>
+              <w:top w:type="dxa" w:w="40"/>
+              <w:left w:type="dxa" w:w="80"/>
+              <w:bottom w:type="dxa" w:w="40"/>
+              <w:right w:type="dxa" w:w="80"/>
+            </w:tcMar>
+          </w:tcPr>
+          <w:p>
+            <w:pPr>
+              <w:spacing w:line="276" w:lineRule="auto"/>
+            </w:pPr>
+          </w:p>
+        </w:tc>
+        <w:tc>
+          <w:tcPr>
+            <w:tcW w:type="dxa" w:w="794"/>
+            <w:tcBorders>
+              <w:top w:val="none" w:color="FFFFFF" w:sz="0"/>
+              <w:left w:val="none" w:color="FFFFFF" w:sz="0"/>
+              <w:bottom w:val="single" w:color="000000" w:sz="6"/>
+              <w:right w:val="none" w:color="FFFFFF" w:sz="0"/>
+            </w:tcBorders>
+            <w:tcMar>
+              <w:top w:type="dxa" w:w="40"/>
+              <w:left w:type="dxa" w:w="80"/>
+              <w:bottom w:type="dxa" w:w="40"/>
+              <w:right w:type="dxa" w:w="80"/>
+            </w:tcMar>
+          </w:tcPr>
+          <w:p>
+            <w:pPr>
+              <w:spacing w:line="276" w:lineRule="auto"/>
+            </w:pPr>
+          </w:p>
+        </w:tc>
+      </w:tr>
+    </w:tbl>
+    <w:p>
+      <w:pPr>
+        <w:spacing w:after="240" w:before="60" w:line="276" w:lineRule="auto"/>
+        <w:jc w:val="both"/>
+      </w:pPr>
+      <w:r>
+        <w:rPr>
+          <w:rFonts w:ascii="Times New Roman" w:cs="Times New Roman" w:eastAsia="SimSun" w:hAnsi="Times New Roman"/>
+          <w:i/>
+          <w:iCs/>
+          <w:sz w:val="20"/>
+          <w:szCs w:val="20"/>
+        </w:rPr>
+        <w:t xml:space="preserve">Note. </w:t>
+      </w:r>
+      <w:r>
+        <w:rPr>
+          <w:rFonts w:ascii="Times New Roman" w:cs="Times New Roman" w:eastAsia="SimSun" w:hAnsi="Times New Roman"/>
+          <w:sz w:val="20"/>
+          <w:szCs w:val="20"/>
+        </w:rPr>
+        <w:t xml:space="preserve">From outputs/logs. Model identifiers returned by the providers are listed with the results.</w:t>
       </w:r>
     </w:p>
     <w:p>

</xml_diff>